<commit_message>
Datos del alumno, materia y animaciones en la presentación e informe
Co-Authored-By: Claude Opus 5.5 <noreply@anthropic.com>
</commit_message>
<xml_diff>
--- a/docs/Informe_de_Cierre_Conecta_Mas.docx
+++ b/docs/Informe_de_Cierre_Conecta_Mas.docx
@@ -15,7 +15,7 @@
           <w:sz w:val="22"/>
           <w:szCs w:val="22"/>
         </w:rPr>
-        <w:t>INFORME DE CIERRE DEL PROYECTO</w:t>
+        <w:t>INFORME DE CIERRE · PROYECTO FINAL DE INGENIERÍA DE SOFTWARE</w:t>
       </w:r>
     </w:p>
     <w:p>
@@ -56,6 +56,66 @@
     <w:p>
       <w:pPr>
         <w:spacing w:before="200" w:after="80"/>
+      </w:pPr>
+      <w:r>
+        <w:rPr>
+          <w:b/>
+          <w:bCs/>
+        </w:rPr>
+        <w:t xml:space="preserve">Proyecto final de la materia: </w:t>
+      </w:r>
+      <w:r>
+        <w:t>Ingeniería de Software</w:t>
+      </w:r>
+    </w:p>
+    <w:p>
+      <w:pPr>
+        <w:spacing w:after="80"/>
+      </w:pPr>
+      <w:r>
+        <w:rPr>
+          <w:b/>
+          <w:bCs/>
+        </w:rPr>
+        <w:t xml:space="preserve">Alumno: </w:t>
+      </w:r>
+      <w:r>
+        <w:t>Evan David Morales Serrano</w:t>
+      </w:r>
+    </w:p>
+    <w:p>
+      <w:pPr>
+        <w:spacing w:after="80"/>
+      </w:pPr>
+      <w:r>
+        <w:rPr>
+          <w:b/>
+          <w:bCs/>
+        </w:rPr>
+        <w:t xml:space="preserve">Matrícula: </w:t>
+      </w:r>
+      <w:r>
+        <w:t>AL03086130</w:t>
+      </w:r>
+    </w:p>
+    <w:p>
+      <w:pPr>
+        <w:spacing w:after="80"/>
+      </w:pPr>
+      <w:r>
+        <w:rPr>
+          <w:b/>
+          <w:bCs/>
+        </w:rPr>
+        <w:t xml:space="preserve">Profesor: </w:t>
+      </w:r>
+      <w:r>
+        <w:t>Santos Guadalupe Facio Barraza</w:t>
+      </w:r>
+    </w:p>
+    <w:p>
+      <w:pPr>
+        <w:spacing w:after="80"/>
       </w:pPr>
       <w:r>
         <w:rPr>
@@ -121,7 +181,7 @@
     <w:sdt>
       <w:sdtPr>
         <w:alias w:val="Contenido"/>
-        <w:id w:val="-218599151"/>
+        <w:id w:val="-1467803046"/>
       </w:sdtPr>
       <w:sdtEndPr/>
       <w:sdtContent>
@@ -149,7 +209,7 @@
           <w:r>
             <w:fldChar w:fldCharType="separate"/>
           </w:r>
-          <w:hyperlink w:anchor="_Toc241533313" w:history="1">
+          <w:hyperlink w:anchor="_Toc241535892" w:history="1">
             <w:r>
               <w:rPr>
                 <w:rStyle w:val="Hipervnculo"/>
@@ -173,7 +233,7 @@
               <w:rPr>
                 <w:noProof/>
               </w:rPr>
-              <w:instrText xml:space="preserve"> PAGEREF _Toc241533313 \h </w:instrText>
+              <w:instrText xml:space="preserve"> PAGEREF _Toc241535892 \h </w:instrText>
             </w:r>
             <w:r>
               <w:rPr>
@@ -215,7 +275,7 @@
               <w14:ligatures w14:val="standardContextual"/>
             </w:rPr>
           </w:pPr>
-          <w:hyperlink w:anchor="_Toc241533314" w:history="1">
+          <w:hyperlink w:anchor="_Toc241535893" w:history="1">
             <w:r>
               <w:rPr>
                 <w:rStyle w:val="Hipervnculo"/>
@@ -239,7 +299,7 @@
               <w:rPr>
                 <w:noProof/>
               </w:rPr>
-              <w:instrText xml:space="preserve"> PAGEREF _Toc241533314 \h </w:instrText>
+              <w:instrText xml:space="preserve"> PAGEREF _Toc241535893 \h </w:instrText>
             </w:r>
             <w:r>
               <w:rPr>
@@ -281,7 +341,7 @@
               <w14:ligatures w14:val="standardContextual"/>
             </w:rPr>
           </w:pPr>
-          <w:hyperlink w:anchor="_Toc241533315" w:history="1">
+          <w:hyperlink w:anchor="_Toc241535894" w:history="1">
             <w:r>
               <w:rPr>
                 <w:rStyle w:val="Hipervnculo"/>
@@ -305,7 +365,7 @@
               <w:rPr>
                 <w:noProof/>
               </w:rPr>
-              <w:instrText xml:space="preserve"> PAGEREF _Toc241533315 \h </w:instrText>
+              <w:instrText xml:space="preserve"> PAGEREF _Toc241535894 \h </w:instrText>
             </w:r>
             <w:r>
               <w:rPr>
@@ -347,7 +407,7 @@
               <w14:ligatures w14:val="standardContextual"/>
             </w:rPr>
           </w:pPr>
-          <w:hyperlink w:anchor="_Toc241533316" w:history="1">
+          <w:hyperlink w:anchor="_Toc241535895" w:history="1">
             <w:r>
               <w:rPr>
                 <w:rStyle w:val="Hipervnculo"/>
@@ -371,7 +431,7 @@
               <w:rPr>
                 <w:noProof/>
               </w:rPr>
-              <w:instrText xml:space="preserve"> PAGEREF _Toc241533316 \h </w:instrText>
+              <w:instrText xml:space="preserve"> PAGEREF _Toc241535895 \h </w:instrText>
             </w:r>
             <w:r>
               <w:rPr>
@@ -413,7 +473,7 @@
               <w14:ligatures w14:val="standardContextual"/>
             </w:rPr>
           </w:pPr>
-          <w:hyperlink w:anchor="_Toc241533317" w:history="1">
+          <w:hyperlink w:anchor="_Toc241535896" w:history="1">
             <w:r>
               <w:rPr>
                 <w:rStyle w:val="Hipervnculo"/>
@@ -437,7 +497,7 @@
               <w:rPr>
                 <w:noProof/>
               </w:rPr>
-              <w:instrText xml:space="preserve"> PAGEREF _Toc241533317 \h </w:instrText>
+              <w:instrText xml:space="preserve"> PAGEREF _Toc241535896 \h </w:instrText>
             </w:r>
             <w:r>
               <w:rPr>
@@ -479,7 +539,7 @@
               <w14:ligatures w14:val="standardContextual"/>
             </w:rPr>
           </w:pPr>
-          <w:hyperlink w:anchor="_Toc241533318" w:history="1">
+          <w:hyperlink w:anchor="_Toc241535897" w:history="1">
             <w:r>
               <w:rPr>
                 <w:rStyle w:val="Hipervnculo"/>
@@ -503,7 +563,7 @@
               <w:rPr>
                 <w:noProof/>
               </w:rPr>
-              <w:instrText xml:space="preserve"> PAGEREF _Toc241533318 \h </w:instrText>
+              <w:instrText xml:space="preserve"> PAGEREF _Toc241535897 \h </w:instrText>
             </w:r>
             <w:r>
               <w:rPr>
@@ -545,7 +605,7 @@
               <w14:ligatures w14:val="standardContextual"/>
             </w:rPr>
           </w:pPr>
-          <w:hyperlink w:anchor="_Toc241533319" w:history="1">
+          <w:hyperlink w:anchor="_Toc241535898" w:history="1">
             <w:r>
               <w:rPr>
                 <w:rStyle w:val="Hipervnculo"/>
@@ -569,7 +629,7 @@
               <w:rPr>
                 <w:noProof/>
               </w:rPr>
-              <w:instrText xml:space="preserve"> PAGEREF _Toc241533319 \h </w:instrText>
+              <w:instrText xml:space="preserve"> PAGEREF _Toc241535898 \h </w:instrText>
             </w:r>
             <w:r>
               <w:rPr>
@@ -611,7 +671,7 @@
               <w14:ligatures w14:val="standardContextual"/>
             </w:rPr>
           </w:pPr>
-          <w:hyperlink w:anchor="_Toc241533320" w:history="1">
+          <w:hyperlink w:anchor="_Toc241535899" w:history="1">
             <w:r>
               <w:rPr>
                 <w:rStyle w:val="Hipervnculo"/>
@@ -635,7 +695,7 @@
               <w:rPr>
                 <w:noProof/>
               </w:rPr>
-              <w:instrText xml:space="preserve"> PAGEREF _Toc241533320 \h </w:instrText>
+              <w:instrText xml:space="preserve"> PAGEREF _Toc241535899 \h </w:instrText>
             </w:r>
             <w:r>
               <w:rPr>
@@ -677,7 +737,7 @@
               <w14:ligatures w14:val="standardContextual"/>
             </w:rPr>
           </w:pPr>
-          <w:hyperlink w:anchor="_Toc241533321" w:history="1">
+          <w:hyperlink w:anchor="_Toc241535900" w:history="1">
             <w:r>
               <w:rPr>
                 <w:rStyle w:val="Hipervnculo"/>
@@ -701,7 +761,7 @@
               <w:rPr>
                 <w:noProof/>
               </w:rPr>
-              <w:instrText xml:space="preserve"> PAGEREF _Toc241533321 \h </w:instrText>
+              <w:instrText xml:space="preserve"> PAGEREF _Toc241535900 \h </w:instrText>
             </w:r>
             <w:r>
               <w:rPr>
@@ -743,7 +803,7 @@
               <w14:ligatures w14:val="standardContextual"/>
             </w:rPr>
           </w:pPr>
-          <w:hyperlink w:anchor="_Toc241533322" w:history="1">
+          <w:hyperlink w:anchor="_Toc241535901" w:history="1">
             <w:r>
               <w:rPr>
                 <w:rStyle w:val="Hipervnculo"/>
@@ -767,7 +827,7 @@
               <w:rPr>
                 <w:noProof/>
               </w:rPr>
-              <w:instrText xml:space="preserve"> PAGEREF _Toc241533322 \h </w:instrText>
+              <w:instrText xml:space="preserve"> PAGEREF _Toc241535901 \h </w:instrText>
             </w:r>
             <w:r>
               <w:rPr>
@@ -809,7 +869,7 @@
               <w14:ligatures w14:val="standardContextual"/>
             </w:rPr>
           </w:pPr>
-          <w:hyperlink w:anchor="_Toc241533323" w:history="1">
+          <w:hyperlink w:anchor="_Toc241535902" w:history="1">
             <w:r>
               <w:rPr>
                 <w:rStyle w:val="Hipervnculo"/>
@@ -833,7 +893,7 @@
               <w:rPr>
                 <w:noProof/>
               </w:rPr>
-              <w:instrText xml:space="preserve"> PAGEREF _Toc241533323 \h </w:instrText>
+              <w:instrText xml:space="preserve"> PAGEREF _Toc241535902 \h </w:instrText>
             </w:r>
             <w:r>
               <w:rPr>
@@ -875,7 +935,7 @@
               <w14:ligatures w14:val="standardContextual"/>
             </w:rPr>
           </w:pPr>
-          <w:hyperlink w:anchor="_Toc241533324" w:history="1">
+          <w:hyperlink w:anchor="_Toc241535903" w:history="1">
             <w:r>
               <w:rPr>
                 <w:rStyle w:val="Hipervnculo"/>
@@ -899,7 +959,7 @@
               <w:rPr>
                 <w:noProof/>
               </w:rPr>
-              <w:instrText xml:space="preserve"> PAGEREF _Toc241533324 \h </w:instrText>
+              <w:instrText xml:space="preserve"> PAGEREF _Toc241535903 \h </w:instrText>
             </w:r>
             <w:r>
               <w:rPr>
@@ -941,7 +1001,7 @@
               <w14:ligatures w14:val="standardContextual"/>
             </w:rPr>
           </w:pPr>
-          <w:hyperlink w:anchor="_Toc241533325" w:history="1">
+          <w:hyperlink w:anchor="_Toc241535904" w:history="1">
             <w:r>
               <w:rPr>
                 <w:rStyle w:val="Hipervnculo"/>
@@ -965,7 +1025,7 @@
               <w:rPr>
                 <w:noProof/>
               </w:rPr>
-              <w:instrText xml:space="preserve"> PAGEREF _Toc241533325 \h </w:instrText>
+              <w:instrText xml:space="preserve"> PAGEREF _Toc241535904 \h </w:instrText>
             </w:r>
             <w:r>
               <w:rPr>
@@ -1007,7 +1067,7 @@
               <w14:ligatures w14:val="standardContextual"/>
             </w:rPr>
           </w:pPr>
-          <w:hyperlink w:anchor="_Toc241533326" w:history="1">
+          <w:hyperlink w:anchor="_Toc241535905" w:history="1">
             <w:r>
               <w:rPr>
                 <w:rStyle w:val="Hipervnculo"/>
@@ -1031,7 +1091,7 @@
               <w:rPr>
                 <w:noProof/>
               </w:rPr>
-              <w:instrText xml:space="preserve"> PAGEREF _Toc241533326 \h </w:instrText>
+              <w:instrText xml:space="preserve"> PAGEREF _Toc241535905 \h </w:instrText>
             </w:r>
             <w:r>
               <w:rPr>
@@ -1073,7 +1133,7 @@
               <w14:ligatures w14:val="standardContextual"/>
             </w:rPr>
           </w:pPr>
-          <w:hyperlink w:anchor="_Toc241533327" w:history="1">
+          <w:hyperlink w:anchor="_Toc241535906" w:history="1">
             <w:r>
               <w:rPr>
                 <w:rStyle w:val="Hipervnculo"/>
@@ -1097,7 +1157,7 @@
               <w:rPr>
                 <w:noProof/>
               </w:rPr>
-              <w:instrText xml:space="preserve"> PAGEREF _Toc241533327 \h </w:instrText>
+              <w:instrText xml:space="preserve"> PAGEREF _Toc241535906 \h </w:instrText>
             </w:r>
             <w:r>
               <w:rPr>
@@ -1139,7 +1199,7 @@
               <w14:ligatures w14:val="standardContextual"/>
             </w:rPr>
           </w:pPr>
-          <w:hyperlink w:anchor="_Toc241533328" w:history="1">
+          <w:hyperlink w:anchor="_Toc241535907" w:history="1">
             <w:r>
               <w:rPr>
                 <w:rStyle w:val="Hipervnculo"/>
@@ -1163,7 +1223,7 @@
               <w:rPr>
                 <w:noProof/>
               </w:rPr>
-              <w:instrText xml:space="preserve"> PAGEREF _Toc241533328 \h </w:instrText>
+              <w:instrText xml:space="preserve"> PAGEREF _Toc241535907 \h </w:instrText>
             </w:r>
             <w:r>
               <w:rPr>
@@ -1205,7 +1265,7 @@
               <w14:ligatures w14:val="standardContextual"/>
             </w:rPr>
           </w:pPr>
-          <w:hyperlink w:anchor="_Toc241533329" w:history="1">
+          <w:hyperlink w:anchor="_Toc241535908" w:history="1">
             <w:r>
               <w:rPr>
                 <w:rStyle w:val="Hipervnculo"/>
@@ -1229,7 +1289,7 @@
               <w:rPr>
                 <w:noProof/>
               </w:rPr>
-              <w:instrText xml:space="preserve"> PAGEREF _Toc241533329 \h </w:instrText>
+              <w:instrText xml:space="preserve"> PAGEREF _Toc241535908 \h </w:instrText>
             </w:r>
             <w:r>
               <w:rPr>
@@ -1271,7 +1331,7 @@
               <w14:ligatures w14:val="standardContextual"/>
             </w:rPr>
           </w:pPr>
-          <w:hyperlink w:anchor="_Toc241533330" w:history="1">
+          <w:hyperlink w:anchor="_Toc241535909" w:history="1">
             <w:r>
               <w:rPr>
                 <w:rStyle w:val="Hipervnculo"/>
@@ -1295,7 +1355,7 @@
               <w:rPr>
                 <w:noProof/>
               </w:rPr>
-              <w:instrText xml:space="preserve"> PAGEREF _Toc241533330 \h </w:instrText>
+              <w:instrText xml:space="preserve"> PAGEREF _Toc241535909 \h </w:instrText>
             </w:r>
             <w:r>
               <w:rPr>
@@ -1337,7 +1397,7 @@
               <w14:ligatures w14:val="standardContextual"/>
             </w:rPr>
           </w:pPr>
-          <w:hyperlink w:anchor="_Toc241533331" w:history="1">
+          <w:hyperlink w:anchor="_Toc241535910" w:history="1">
             <w:r>
               <w:rPr>
                 <w:rStyle w:val="Hipervnculo"/>
@@ -1361,7 +1421,7 @@
               <w:rPr>
                 <w:noProof/>
               </w:rPr>
-              <w:instrText xml:space="preserve"> PAGEREF _Toc241533331 \h </w:instrText>
+              <w:instrText xml:space="preserve"> PAGEREF _Toc241535910 \h </w:instrText>
             </w:r>
             <w:r>
               <w:rPr>
@@ -1403,7 +1463,7 @@
               <w14:ligatures w14:val="standardContextual"/>
             </w:rPr>
           </w:pPr>
-          <w:hyperlink w:anchor="_Toc241533332" w:history="1">
+          <w:hyperlink w:anchor="_Toc241535911" w:history="1">
             <w:r>
               <w:rPr>
                 <w:rStyle w:val="Hipervnculo"/>
@@ -1427,7 +1487,7 @@
               <w:rPr>
                 <w:noProof/>
               </w:rPr>
-              <w:instrText xml:space="preserve"> PAGEREF _Toc241533332 \h </w:instrText>
+              <w:instrText xml:space="preserve"> PAGEREF _Toc241535911 \h </w:instrText>
             </w:r>
             <w:r>
               <w:rPr>
@@ -1470,7 +1530,7 @@
       <w:pPr>
         <w:pStyle w:val="Ttulo1"/>
       </w:pPr>
-      <w:bookmarkStart w:id="0" w:name="_Toc241533313"/>
+      <w:bookmarkStart w:id="0" w:name="_Toc241535892"/>
       <w:r>
         <w:lastRenderedPageBreak/>
         <w:t>1. Resumen ejecutivo</w:t>
@@ -2163,7 +2223,7 @@
       <w:pPr>
         <w:pStyle w:val="Ttulo1"/>
       </w:pPr>
-      <w:bookmarkStart w:id="1" w:name="_Toc241533314"/>
+      <w:bookmarkStart w:id="1" w:name="_Toc241535893"/>
       <w:r>
         <w:t>2. Alcance y solución implementada</w:t>
       </w:r>
@@ -2173,7 +2233,7 @@
       <w:pPr>
         <w:pStyle w:val="Ttulo2"/>
       </w:pPr>
-      <w:bookmarkStart w:id="2" w:name="_Toc241533315"/>
+      <w:bookmarkStart w:id="2" w:name="_Toc241535894"/>
       <w:r>
         <w:t>2.1 Roles del sistema</w:t>
       </w:r>
@@ -2469,7 +2529,7 @@
       <w:pPr>
         <w:pStyle w:val="Ttulo2"/>
       </w:pPr>
-      <w:bookmarkStart w:id="3" w:name="_Toc241533316"/>
+      <w:bookmarkStart w:id="3" w:name="_Toc241535895"/>
       <w:r>
         <w:t>2.2 Ruta guiada por rol</w:t>
       </w:r>
@@ -2493,7 +2553,7 @@
         </w:rPr>
         <w:lastRenderedPageBreak/>
         <w:drawing>
-          <wp:inline distT="0" distB="0" distL="0" distR="0" wp14:anchorId="6BA10123" wp14:editId="1AB57F72">
+          <wp:inline distT="0" distB="0" distL="0" distR="0" wp14:anchorId="09C6A018" wp14:editId="23F85F4F">
             <wp:extent cx="5334000" cy="3333750"/>
             <wp:effectExtent l="0" t="0" r="0" b="0"/>
             <wp:docPr id="1" name="ruta-guiada-admin.png" descr="ruta-guiada-admin.png" title="ruta-guiada-admin.png"/>
@@ -2552,7 +2612,7 @@
       <w:pPr>
         <w:pStyle w:val="Ttulo2"/>
       </w:pPr>
-      <w:bookmarkStart w:id="4" w:name="_Toc241533317"/>
+      <w:bookmarkStart w:id="4" w:name="_Toc241535896"/>
       <w:r>
         <w:t>2.3 Flujo de una donación</w:t>
       </w:r>
@@ -2570,7 +2630,7 @@
       <w:pPr>
         <w:pStyle w:val="Ttulo2"/>
       </w:pPr>
-      <w:bookmarkStart w:id="5" w:name="_Toc241533318"/>
+      <w:bookmarkStart w:id="5" w:name="_Toc241535897"/>
       <w:r>
         <w:t>2.4 Arquitectura y decisiones técnicas</w:t>
       </w:r>
@@ -2671,7 +2731,7 @@
         </w:rPr>
         <w:lastRenderedPageBreak/>
         <w:drawing>
-          <wp:inline distT="0" distB="0" distL="0" distR="0" wp14:anchorId="3FE70943" wp14:editId="1D5B28CF">
+          <wp:inline distT="0" distB="0" distL="0" distR="0" wp14:anchorId="0A6D2215" wp14:editId="17C144F1">
             <wp:extent cx="5715000" cy="4105275"/>
             <wp:effectExtent l="0" t="0" r="0" b="0"/>
             <wp:docPr id="2" name="desk-donador-panel.png" descr="desk-donador-panel.png" title="desk-donador-panel.png"/>
@@ -2735,7 +2795,7 @@
           <w:noProof/>
         </w:rPr>
         <w:drawing>
-          <wp:inline distT="0" distB="0" distL="0" distR="0" wp14:anchorId="4D393C07" wp14:editId="27C0C68A">
+          <wp:inline distT="0" distB="0" distL="0" distR="0" wp14:anchorId="6C7E85B3" wp14:editId="4CDC0E0D">
             <wp:extent cx="5715000" cy="3571875"/>
             <wp:effectExtent l="0" t="0" r="0" b="0"/>
             <wp:docPr id="3" name="desk-admin-solicitudes.png" descr="desk-admin-solicitudes.png" title="desk-admin-solicitudes.png"/>
@@ -2800,7 +2860,7 @@
       <w:pPr>
         <w:pStyle w:val="Ttulo1"/>
       </w:pPr>
-      <w:bookmarkStart w:id="6" w:name="_Toc241533319"/>
+      <w:bookmarkStart w:id="6" w:name="_Toc241535898"/>
       <w:r>
         <w:lastRenderedPageBreak/>
         <w:t>3. Comparación entre lo planificado y lo ejecutado</w:t>
@@ -5378,7 +5438,7 @@
       <w:pPr>
         <w:pStyle w:val="Ttulo2"/>
       </w:pPr>
-      <w:bookmarkStart w:id="7" w:name="_Toc241533320"/>
+      <w:bookmarkStart w:id="7" w:name="_Toc241535899"/>
       <w:r>
         <w:lastRenderedPageBreak/>
         <w:t>3.1 Alcance planificado frente al entregado</w:t>
@@ -6234,7 +6294,7 @@
       <w:pPr>
         <w:pStyle w:val="Ttulo2"/>
       </w:pPr>
-      <w:bookmarkStart w:id="8" w:name="_Toc241533321"/>
+      <w:bookmarkStart w:id="8" w:name="_Toc241535900"/>
       <w:r>
         <w:t>3.2 Incidentes que afectaron el cronograma</w:t>
       </w:r>
@@ -6369,7 +6429,7 @@
       <w:pPr>
         <w:pStyle w:val="Ttulo1"/>
       </w:pPr>
-      <w:bookmarkStart w:id="9" w:name="_Toc241533322"/>
+      <w:bookmarkStart w:id="9" w:name="_Toc241535901"/>
       <w:r>
         <w:lastRenderedPageBreak/>
         <w:t>4. Resultados de pruebas y calidad</w:t>
@@ -6380,7 +6440,7 @@
       <w:pPr>
         <w:pStyle w:val="Ttulo2"/>
       </w:pPr>
-      <w:bookmarkStart w:id="10" w:name="_Toc241533323"/>
+      <w:bookmarkStart w:id="10" w:name="_Toc241535902"/>
       <w:r>
         <w:t>4.1 Pruebas unitarias y de integración (Jest + Supertest)</w:t>
       </w:r>
@@ -6885,7 +6945,7 @@
       <w:pPr>
         <w:pStyle w:val="Ttulo2"/>
       </w:pPr>
-      <w:bookmarkStart w:id="11" w:name="_Toc241533324"/>
+      <w:bookmarkStart w:id="11" w:name="_Toc241535903"/>
       <w:r>
         <w:t>4.2 Pruebas de seguridad (OWASP ZAP)</w:t>
       </w:r>
@@ -7955,7 +8015,7 @@
       <w:pPr>
         <w:pStyle w:val="Ttulo2"/>
       </w:pPr>
-      <w:bookmarkStart w:id="12" w:name="_Toc241533325"/>
+      <w:bookmarkStart w:id="12" w:name="_Toc241535904"/>
       <w:r>
         <w:t>4.3 Análisis de calidad del código (SonarQube)</w:t>
       </w:r>
@@ -9360,7 +9420,7 @@
       <w:pPr>
         <w:pStyle w:val="Ttulo1"/>
       </w:pPr>
-      <w:bookmarkStart w:id="13" w:name="_Toc241533326"/>
+      <w:bookmarkStart w:id="13" w:name="_Toc241535905"/>
       <w:r>
         <w:lastRenderedPageBreak/>
         <w:t>5. Lecciones aprendidas</w:t>
@@ -9371,7 +9431,7 @@
       <w:pPr>
         <w:pStyle w:val="Ttulo2"/>
       </w:pPr>
-      <w:bookmarkStart w:id="14" w:name="_Toc241533327"/>
+      <w:bookmarkStart w:id="14" w:name="_Toc241535906"/>
       <w:r>
         <w:t>5.1 Durante la planificación</w:t>
       </w:r>
@@ -9481,7 +9541,7 @@
       <w:pPr>
         <w:pStyle w:val="Ttulo2"/>
       </w:pPr>
-      <w:bookmarkStart w:id="15" w:name="_Toc241533328"/>
+      <w:bookmarkStart w:id="15" w:name="_Toc241535907"/>
       <w:r>
         <w:t>5.2 Durante la implementación</w:t>
       </w:r>
@@ -9611,7 +9671,7 @@
       <w:pPr>
         <w:pStyle w:val="Ttulo1"/>
       </w:pPr>
-      <w:bookmarkStart w:id="16" w:name="_Toc241533329"/>
+      <w:bookmarkStart w:id="16" w:name="_Toc241535908"/>
       <w:r>
         <w:t>6. Plan de mejora continua</w:t>
       </w:r>
@@ -10802,7 +10862,7 @@
       <w:pPr>
         <w:pStyle w:val="Ttulo2"/>
       </w:pPr>
-      <w:bookmarkStart w:id="17" w:name="_Toc241533330"/>
+      <w:bookmarkStart w:id="17" w:name="_Toc241535909"/>
       <w:r>
         <w:t>6.1 Propuestas de innovación</w:t>
       </w:r>
@@ -10892,7 +10952,7 @@
       <w:pPr>
         <w:pStyle w:val="Ttulo2"/>
       </w:pPr>
-      <w:bookmarkStart w:id="18" w:name="_Toc241533331"/>
+      <w:bookmarkStart w:id="18" w:name="_Toc241535910"/>
       <w:r>
         <w:t>6.2 Seguimiento</w:t>
       </w:r>
@@ -10910,7 +10970,7 @@
       <w:pPr>
         <w:pStyle w:val="Ttulo1"/>
       </w:pPr>
-      <w:bookmarkStart w:id="19" w:name="_Toc241533332"/>
+      <w:bookmarkStart w:id="19" w:name="_Toc241535911"/>
       <w:r>
         <w:t>7. Conclusiones</w:t>
       </w:r>
@@ -11061,10 +11121,64 @@
 <file path=word/numbering.xml><?xml version="1.0" encoding="utf-8"?>
 <w:numbering xmlns:wpc="http://schemas.microsoft.com/office/word/2010/wordprocessingCanvas" xmlns:cx="http://schemas.microsoft.com/office/drawing/2014/chartex" xmlns:cx1="http://schemas.microsoft.com/office/drawing/2015/9/8/chartex" xmlns:cx2="http://schemas.microsoft.com/office/drawing/2015/10/21/chartex" xmlns:cx3="http://schemas.microsoft.com/office/drawing/2016/5/9/chartex" xmlns:cx4="http://schemas.microsoft.com/office/drawing/2016/5/10/chartex" xmlns:cx5="http://schemas.microsoft.com/office/drawing/2016/5/11/chartex" xmlns:cx6="http://schemas.microsoft.com/office/drawing/2016/5/12/chartex" xmlns:cx7="http://schemas.microsoft.com/office/drawing/2016/5/13/chartex" xmlns:cx8="http://schemas.microsoft.com/office/drawing/2016/5/14/chartex" xmlns:mc="http://schemas.openxmlformats.org/markup-compatibility/2006" xmlns:aink="http://schemas.microsoft.com/office/drawing/2016/ink" xmlns:am3d="http://schemas.microsoft.com/office/drawing/2017/model3d" xmlns:o="urn:schemas-microsoft-com:office:office" xmlns:oel="http://schemas.microsoft.com/office/2019/extlst" xmlns:r="http://schemas.openxmlformats.org/officeDocument/2006/relationships" xmlns:m="http://schemas.openxmlformats.org/officeDocument/2006/math" xmlns:v="urn:schemas-microsoft-com:vml" xmlns:wp14="http://schemas.microsoft.com/office/word/2010/wordprocessingDrawing" xmlns:wp="http://schemas.openxmlformats.org/drawingml/2006/wordprocessingDrawing" xmlns:w10="urn:schemas-microsoft-com:office:word" xmlns:w="http://schemas.openxmlformats.org/wordprocessingml/2006/main" xmlns:w14="http://schemas.microsoft.com/office/word/2010/wordml" xmlns:w15="http://schemas.microsoft.com/office/word/2012/wordml" xmlns:w16cex="http://schemas.microsoft.com/office/word/2018/wordml/cex" xmlns:w16cid="http://schemas.microsoft.com/office/word/2016/wordml/cid" xmlns:w16="http://schemas.microsoft.com/office/word/2018/wordml" xmlns:w16du="http://schemas.microsoft.com/office/word/2023/wordml/word16du" xmlns:w16sdtdh="http://schemas.microsoft.com/office/word/2020/wordml/sdtdatahash" xmlns:w16sdtfl="http://schemas.microsoft.com/office/word/2024/wordml/sdtformatlock" xmlns:w16se="http://schemas.microsoft.com/office/word/2015/wordml/symex" xmlns:wpg="http://schemas.microsoft.com/office/word/2010/wordprocessingGroup" xmlns:wpi="http://schemas.microsoft.com/office/word/2010/wordprocessingInk" xmlns:wne="http://schemas.microsoft.com/office/word/2006/wordml" xmlns:wps="http://schemas.microsoft.com/office/word/2010/wordprocessingShape" mc:Ignorable="w14 w15 w16se w16cid w16 w16cex w16sdtdh w16sdtfl w16du wp14">
   <w:abstractNum w:abstractNumId="0" w15:restartNumberingAfterBreak="0">
-    <w:nsid w:val="29A83AAC"/>
+    <w:nsid w:val="07D950B9"/>
     <w:multiLevelType w:val="hybridMultilevel"/>
-    <w:tmpl w:val="27B82F78"/>
-    <w:lvl w:ilvl="0" w:tplc="990CFF8E" w:tentative="1">
+    <w:tmpl w:val="3D5083F6"/>
+    <w:lvl w:ilvl="0" w:tplc="F44E0F48">
+      <w:start w:val="1"/>
+      <w:numFmt w:val="bullet"/>
+      <w:lvlText w:val="•"/>
+      <w:lvlJc w:val="left"/>
+      <w:pPr>
+        <w:ind w:left="540" w:hanging="270"/>
+      </w:pPr>
+    </w:lvl>
+    <w:lvl w:ilvl="1" w:tplc="B5D2BF46">
+      <w:numFmt w:val="decimal"/>
+      <w:lvlText w:val=""/>
+      <w:lvlJc w:val="left"/>
+    </w:lvl>
+    <w:lvl w:ilvl="2" w:tplc="902C8D44">
+      <w:numFmt w:val="decimal"/>
+      <w:lvlText w:val=""/>
+      <w:lvlJc w:val="left"/>
+    </w:lvl>
+    <w:lvl w:ilvl="3" w:tplc="08805F44">
+      <w:numFmt w:val="decimal"/>
+      <w:lvlText w:val=""/>
+      <w:lvlJc w:val="left"/>
+    </w:lvl>
+    <w:lvl w:ilvl="4" w:tplc="2D4AF7D4">
+      <w:numFmt w:val="decimal"/>
+      <w:lvlText w:val=""/>
+      <w:lvlJc w:val="left"/>
+    </w:lvl>
+    <w:lvl w:ilvl="5" w:tplc="0C5C704C">
+      <w:numFmt w:val="decimal"/>
+      <w:lvlText w:val=""/>
+      <w:lvlJc w:val="left"/>
+    </w:lvl>
+    <w:lvl w:ilvl="6" w:tplc="A0AA1B70">
+      <w:numFmt w:val="decimal"/>
+      <w:lvlText w:val=""/>
+      <w:lvlJc w:val="left"/>
+    </w:lvl>
+    <w:lvl w:ilvl="7" w:tplc="176CCDF8">
+      <w:numFmt w:val="decimal"/>
+      <w:lvlText w:val=""/>
+      <w:lvlJc w:val="left"/>
+    </w:lvl>
+    <w:lvl w:ilvl="8" w:tplc="202ED9D0">
+      <w:numFmt w:val="decimal"/>
+      <w:lvlText w:val=""/>
+      <w:lvlJc w:val="left"/>
+    </w:lvl>
+  </w:abstractNum>
+  <w:abstractNum w:abstractNumId="1" w15:restartNumberingAfterBreak="0">
+    <w:nsid w:val="236A618D"/>
+    <w:multiLevelType w:val="hybridMultilevel"/>
+    <w:tmpl w:val="B89E0768"/>
+    <w:lvl w:ilvl="0" w:tplc="7F44EE36" w:tentative="1">
       <w:start w:val="1"/>
       <w:numFmt w:val="bullet"/>
       <w:lvlText w:val="●"/>
@@ -11073,7 +11187,7 @@
         <w:ind w:left="720" w:hanging="360"/>
       </w:pPr>
     </w:lvl>
-    <w:lvl w:ilvl="1" w:tplc="8650275E" w:tentative="1">
+    <w:lvl w:ilvl="1" w:tplc="1E94595E" w:tentative="1">
       <w:start w:val="1"/>
       <w:numFmt w:val="bullet"/>
       <w:lvlText w:val="○"/>
@@ -11082,7 +11196,7 @@
         <w:ind w:left="1440" w:hanging="360"/>
       </w:pPr>
     </w:lvl>
-    <w:lvl w:ilvl="2" w:tplc="A9FE05B4" w:tentative="1">
+    <w:lvl w:ilvl="2" w:tplc="FC726C14" w:tentative="1">
       <w:start w:val="1"/>
       <w:numFmt w:val="bullet"/>
       <w:lvlText w:val="■"/>
@@ -11091,7 +11205,7 @@
         <w:ind w:left="2160" w:hanging="360"/>
       </w:pPr>
     </w:lvl>
-    <w:lvl w:ilvl="3" w:tplc="1C983E40" w:tentative="1">
+    <w:lvl w:ilvl="3" w:tplc="C5F03F74" w:tentative="1">
       <w:start w:val="1"/>
       <w:numFmt w:val="bullet"/>
       <w:lvlText w:val="●"/>
@@ -11100,7 +11214,7 @@
         <w:ind w:left="2880" w:hanging="360"/>
       </w:pPr>
     </w:lvl>
-    <w:lvl w:ilvl="4" w:tplc="824ABD18" w:tentative="1">
+    <w:lvl w:ilvl="4" w:tplc="B9381954" w:tentative="1">
       <w:start w:val="1"/>
       <w:numFmt w:val="bullet"/>
       <w:lvlText w:val="○"/>
@@ -11109,7 +11223,7 @@
         <w:ind w:left="3600" w:hanging="360"/>
       </w:pPr>
     </w:lvl>
-    <w:lvl w:ilvl="5" w:tplc="BA3CFF72" w:tentative="1">
+    <w:lvl w:ilvl="5" w:tplc="FEC208E8" w:tentative="1">
       <w:start w:val="1"/>
       <w:numFmt w:val="bullet"/>
       <w:lvlText w:val="■"/>
@@ -11118,7 +11232,7 @@
         <w:ind w:left="4320" w:hanging="360"/>
       </w:pPr>
     </w:lvl>
-    <w:lvl w:ilvl="6" w:tplc="6BB8E0B2" w:tentative="1">
+    <w:lvl w:ilvl="6" w:tplc="00F4E6A8" w:tentative="1">
       <w:start w:val="1"/>
       <w:numFmt w:val="bullet"/>
       <w:lvlText w:val="●"/>
@@ -11127,7 +11241,7 @@
         <w:ind w:left="5040" w:hanging="360"/>
       </w:pPr>
     </w:lvl>
-    <w:lvl w:ilvl="7" w:tplc="A5622486" w:tentative="1">
+    <w:lvl w:ilvl="7" w:tplc="439E6F8A" w:tentative="1">
       <w:start w:val="1"/>
       <w:numFmt w:val="bullet"/>
       <w:lvlText w:val="●"/>
@@ -11136,7 +11250,7 @@
         <w:ind w:left="5760" w:hanging="360"/>
       </w:pPr>
     </w:lvl>
-    <w:lvl w:ilvl="8" w:tplc="85022940" w:tentative="1">
+    <w:lvl w:ilvl="8" w:tplc="8FF4F9C8" w:tentative="1">
       <w:start w:val="1"/>
       <w:numFmt w:val="bullet"/>
       <w:lvlText w:val="●"/>
@@ -11146,65 +11260,11 @@
       </w:pPr>
     </w:lvl>
   </w:abstractNum>
-  <w:abstractNum w:abstractNumId="1" w15:restartNumberingAfterBreak="0">
-    <w:nsid w:val="44E42733"/>
+  <w:abstractNum w:abstractNumId="2" w15:restartNumberingAfterBreak="0">
+    <w:nsid w:val="646F453C"/>
     <w:multiLevelType w:val="hybridMultilevel"/>
-    <w:tmpl w:val="205479FA"/>
-    <w:lvl w:ilvl="0" w:tplc="D494B636">
-      <w:start w:val="1"/>
-      <w:numFmt w:val="bullet"/>
-      <w:lvlText w:val="•"/>
-      <w:lvlJc w:val="left"/>
-      <w:pPr>
-        <w:ind w:left="540" w:hanging="270"/>
-      </w:pPr>
-    </w:lvl>
-    <w:lvl w:ilvl="1" w:tplc="C1C656F0">
-      <w:numFmt w:val="decimal"/>
-      <w:lvlText w:val=""/>
-      <w:lvlJc w:val="left"/>
-    </w:lvl>
-    <w:lvl w:ilvl="2" w:tplc="C53053EC">
-      <w:numFmt w:val="decimal"/>
-      <w:lvlText w:val=""/>
-      <w:lvlJc w:val="left"/>
-    </w:lvl>
-    <w:lvl w:ilvl="3" w:tplc="ED00D6A8">
-      <w:numFmt w:val="decimal"/>
-      <w:lvlText w:val=""/>
-      <w:lvlJc w:val="left"/>
-    </w:lvl>
-    <w:lvl w:ilvl="4" w:tplc="ACF22D80">
-      <w:numFmt w:val="decimal"/>
-      <w:lvlText w:val=""/>
-      <w:lvlJc w:val="left"/>
-    </w:lvl>
-    <w:lvl w:ilvl="5" w:tplc="E054B7B0">
-      <w:numFmt w:val="decimal"/>
-      <w:lvlText w:val=""/>
-      <w:lvlJc w:val="left"/>
-    </w:lvl>
-    <w:lvl w:ilvl="6" w:tplc="625E39F2">
-      <w:numFmt w:val="decimal"/>
-      <w:lvlText w:val=""/>
-      <w:lvlJc w:val="left"/>
-    </w:lvl>
-    <w:lvl w:ilvl="7" w:tplc="4B4E8660">
-      <w:numFmt w:val="decimal"/>
-      <w:lvlText w:val=""/>
-      <w:lvlJc w:val="left"/>
-    </w:lvl>
-    <w:lvl w:ilvl="8" w:tplc="753E51F4">
-      <w:numFmt w:val="decimal"/>
-      <w:lvlText w:val=""/>
-      <w:lvlJc w:val="left"/>
-    </w:lvl>
-  </w:abstractNum>
-  <w:abstractNum w:abstractNumId="2" w15:restartNumberingAfterBreak="0">
-    <w:nsid w:val="5E692C6A"/>
-    <w:multiLevelType w:val="hybridMultilevel"/>
-    <w:tmpl w:val="23B40822"/>
-    <w:lvl w:ilvl="0" w:tplc="4AE0D12E">
+    <w:tmpl w:val="879E4544"/>
+    <w:lvl w:ilvl="0" w:tplc="90709430">
       <w:start w:val="1"/>
       <w:numFmt w:val="decimal"/>
       <w:lvlText w:val="%1."/>
@@ -11213,60 +11273,60 @@
         <w:ind w:left="540" w:hanging="300"/>
       </w:pPr>
     </w:lvl>
-    <w:lvl w:ilvl="1" w:tplc="5BA89612">
+    <w:lvl w:ilvl="1" w:tplc="94224B7E">
       <w:numFmt w:val="decimal"/>
       <w:lvlText w:val=""/>
       <w:lvlJc w:val="left"/>
     </w:lvl>
-    <w:lvl w:ilvl="2" w:tplc="CA300688">
+    <w:lvl w:ilvl="2" w:tplc="96802AB2">
       <w:numFmt w:val="decimal"/>
       <w:lvlText w:val=""/>
       <w:lvlJc w:val="left"/>
     </w:lvl>
-    <w:lvl w:ilvl="3" w:tplc="D76A891C">
+    <w:lvl w:ilvl="3" w:tplc="4066E600">
       <w:numFmt w:val="decimal"/>
       <w:lvlText w:val=""/>
       <w:lvlJc w:val="left"/>
     </w:lvl>
-    <w:lvl w:ilvl="4" w:tplc="805E1C16">
+    <w:lvl w:ilvl="4" w:tplc="3898A936">
       <w:numFmt w:val="decimal"/>
       <w:lvlText w:val=""/>
       <w:lvlJc w:val="left"/>
     </w:lvl>
-    <w:lvl w:ilvl="5" w:tplc="F1A6182A">
+    <w:lvl w:ilvl="5" w:tplc="EEE67202">
       <w:numFmt w:val="decimal"/>
       <w:lvlText w:val=""/>
       <w:lvlJc w:val="left"/>
     </w:lvl>
-    <w:lvl w:ilvl="6" w:tplc="7718715C">
+    <w:lvl w:ilvl="6" w:tplc="1D6ADC26">
       <w:numFmt w:val="decimal"/>
       <w:lvlText w:val=""/>
       <w:lvlJc w:val="left"/>
     </w:lvl>
-    <w:lvl w:ilvl="7" w:tplc="307A2CCC">
+    <w:lvl w:ilvl="7" w:tplc="26D874EC">
       <w:numFmt w:val="decimal"/>
       <w:lvlText w:val=""/>
       <w:lvlJc w:val="left"/>
     </w:lvl>
-    <w:lvl w:ilvl="8" w:tplc="0B7E667A">
+    <w:lvl w:ilvl="8" w:tplc="E0CC8E1C">
       <w:numFmt w:val="decimal"/>
       <w:lvlText w:val=""/>
       <w:lvlJc w:val="left"/>
     </w:lvl>
   </w:abstractNum>
-  <w:num w:numId="1" w16cid:durableId="909195404">
+  <w:num w:numId="1" w16cid:durableId="2056001803">
+    <w:abstractNumId w:val="1"/>
+    <w:lvlOverride w:ilvl="0">
+      <w:startOverride w:val="1"/>
+    </w:lvlOverride>
+  </w:num>
+  <w:num w:numId="2" w16cid:durableId="1295066457">
     <w:abstractNumId w:val="0"/>
     <w:lvlOverride w:ilvl="0">
       <w:startOverride w:val="1"/>
     </w:lvlOverride>
   </w:num>
-  <w:num w:numId="2" w16cid:durableId="1780300181">
-    <w:abstractNumId w:val="1"/>
-    <w:lvlOverride w:ilvl="0">
-      <w:startOverride w:val="1"/>
-    </w:lvlOverride>
-  </w:num>
-  <w:num w:numId="3" w16cid:durableId="1577281567">
+  <w:num w:numId="3" w16cid:durableId="755588304">
     <w:abstractNumId w:val="2"/>
     <w:lvlOverride w:ilvl="0">
       <w:startOverride w:val="1"/>
@@ -11908,7 +11968,7 @@
     <w:autoRedefine/>
     <w:uiPriority w:val="39"/>
     <w:unhideWhenUsed/>
-    <w:rsid w:val="00917DE9"/>
+    <w:rsid w:val="002B700D"/>
     <w:pPr>
       <w:spacing w:after="100"/>
     </w:pPr>
@@ -11920,7 +11980,7 @@
     <w:autoRedefine/>
     <w:uiPriority w:val="39"/>
     <w:unhideWhenUsed/>
-    <w:rsid w:val="00917DE9"/>
+    <w:rsid w:val="002B700D"/>
     <w:pPr>
       <w:spacing w:after="100"/>
       <w:ind w:left="210"/>

</xml_diff>

<commit_message>
Evidencia visual real de Jest y SonarQube en la presentación y el informe
Co-Authored-By: Claude Opus 5.5 <noreply@anthropic.com>
</commit_message>
<xml_diff>
--- a/docs/Informe_de_Cierre_Conecta_Mas.docx
+++ b/docs/Informe_de_Cierre_Conecta_Mas.docx
@@ -181,7 +181,7 @@
     <w:sdt>
       <w:sdtPr>
         <w:alias w:val="Contenido"/>
-        <w:id w:val="-1467803046"/>
+        <w:id w:val="963935032"/>
       </w:sdtPr>
       <w:sdtEndPr/>
       <w:sdtContent>
@@ -209,7 +209,7 @@
           <w:r>
             <w:fldChar w:fldCharType="separate"/>
           </w:r>
-          <w:hyperlink w:anchor="_Toc241535892" w:history="1">
+          <w:hyperlink w:anchor="_Toc241537497" w:history="1">
             <w:r>
               <w:rPr>
                 <w:rStyle w:val="Hipervnculo"/>
@@ -233,7 +233,7 @@
               <w:rPr>
                 <w:noProof/>
               </w:rPr>
-              <w:instrText xml:space="preserve"> PAGEREF _Toc241535892 \h </w:instrText>
+              <w:instrText xml:space="preserve"> PAGEREF _Toc241537497 \h </w:instrText>
             </w:r>
             <w:r>
               <w:rPr>
@@ -275,7 +275,7 @@
               <w14:ligatures w14:val="standardContextual"/>
             </w:rPr>
           </w:pPr>
-          <w:hyperlink w:anchor="_Toc241535893" w:history="1">
+          <w:hyperlink w:anchor="_Toc241537498" w:history="1">
             <w:r>
               <w:rPr>
                 <w:rStyle w:val="Hipervnculo"/>
@@ -299,7 +299,7 @@
               <w:rPr>
                 <w:noProof/>
               </w:rPr>
-              <w:instrText xml:space="preserve"> PAGEREF _Toc241535893 \h </w:instrText>
+              <w:instrText xml:space="preserve"> PAGEREF _Toc241537498 \h </w:instrText>
             </w:r>
             <w:r>
               <w:rPr>
@@ -341,7 +341,7 @@
               <w14:ligatures w14:val="standardContextual"/>
             </w:rPr>
           </w:pPr>
-          <w:hyperlink w:anchor="_Toc241535894" w:history="1">
+          <w:hyperlink w:anchor="_Toc241537499" w:history="1">
             <w:r>
               <w:rPr>
                 <w:rStyle w:val="Hipervnculo"/>
@@ -365,7 +365,7 @@
               <w:rPr>
                 <w:noProof/>
               </w:rPr>
-              <w:instrText xml:space="preserve"> PAGEREF _Toc241535894 \h </w:instrText>
+              <w:instrText xml:space="preserve"> PAGEREF _Toc241537499 \h </w:instrText>
             </w:r>
             <w:r>
               <w:rPr>
@@ -407,7 +407,7 @@
               <w14:ligatures w14:val="standardContextual"/>
             </w:rPr>
           </w:pPr>
-          <w:hyperlink w:anchor="_Toc241535895" w:history="1">
+          <w:hyperlink w:anchor="_Toc241537500" w:history="1">
             <w:r>
               <w:rPr>
                 <w:rStyle w:val="Hipervnculo"/>
@@ -431,7 +431,7 @@
               <w:rPr>
                 <w:noProof/>
               </w:rPr>
-              <w:instrText xml:space="preserve"> PAGEREF _Toc241535895 \h </w:instrText>
+              <w:instrText xml:space="preserve"> PAGEREF _Toc241537500 \h </w:instrText>
             </w:r>
             <w:r>
               <w:rPr>
@@ -473,7 +473,7 @@
               <w14:ligatures w14:val="standardContextual"/>
             </w:rPr>
           </w:pPr>
-          <w:hyperlink w:anchor="_Toc241535896" w:history="1">
+          <w:hyperlink w:anchor="_Toc241537501" w:history="1">
             <w:r>
               <w:rPr>
                 <w:rStyle w:val="Hipervnculo"/>
@@ -497,7 +497,7 @@
               <w:rPr>
                 <w:noProof/>
               </w:rPr>
-              <w:instrText xml:space="preserve"> PAGEREF _Toc241535896 \h </w:instrText>
+              <w:instrText xml:space="preserve"> PAGEREF _Toc241537501 \h </w:instrText>
             </w:r>
             <w:r>
               <w:rPr>
@@ -539,7 +539,7 @@
               <w14:ligatures w14:val="standardContextual"/>
             </w:rPr>
           </w:pPr>
-          <w:hyperlink w:anchor="_Toc241535897" w:history="1">
+          <w:hyperlink w:anchor="_Toc241537502" w:history="1">
             <w:r>
               <w:rPr>
                 <w:rStyle w:val="Hipervnculo"/>
@@ -563,7 +563,7 @@
               <w:rPr>
                 <w:noProof/>
               </w:rPr>
-              <w:instrText xml:space="preserve"> PAGEREF _Toc241535897 \h </w:instrText>
+              <w:instrText xml:space="preserve"> PAGEREF _Toc241537502 \h </w:instrText>
             </w:r>
             <w:r>
               <w:rPr>
@@ -605,7 +605,7 @@
               <w14:ligatures w14:val="standardContextual"/>
             </w:rPr>
           </w:pPr>
-          <w:hyperlink w:anchor="_Toc241535898" w:history="1">
+          <w:hyperlink w:anchor="_Toc241537503" w:history="1">
             <w:r>
               <w:rPr>
                 <w:rStyle w:val="Hipervnculo"/>
@@ -629,7 +629,7 @@
               <w:rPr>
                 <w:noProof/>
               </w:rPr>
-              <w:instrText xml:space="preserve"> PAGEREF _Toc241535898 \h </w:instrText>
+              <w:instrText xml:space="preserve"> PAGEREF _Toc241537503 \h </w:instrText>
             </w:r>
             <w:r>
               <w:rPr>
@@ -671,7 +671,7 @@
               <w14:ligatures w14:val="standardContextual"/>
             </w:rPr>
           </w:pPr>
-          <w:hyperlink w:anchor="_Toc241535899" w:history="1">
+          <w:hyperlink w:anchor="_Toc241537504" w:history="1">
             <w:r>
               <w:rPr>
                 <w:rStyle w:val="Hipervnculo"/>
@@ -695,7 +695,7 @@
               <w:rPr>
                 <w:noProof/>
               </w:rPr>
-              <w:instrText xml:space="preserve"> PAGEREF _Toc241535899 \h </w:instrText>
+              <w:instrText xml:space="preserve"> PAGEREF _Toc241537504 \h </w:instrText>
             </w:r>
             <w:r>
               <w:rPr>
@@ -737,7 +737,7 @@
               <w14:ligatures w14:val="standardContextual"/>
             </w:rPr>
           </w:pPr>
-          <w:hyperlink w:anchor="_Toc241535900" w:history="1">
+          <w:hyperlink w:anchor="_Toc241537505" w:history="1">
             <w:r>
               <w:rPr>
                 <w:rStyle w:val="Hipervnculo"/>
@@ -761,7 +761,7 @@
               <w:rPr>
                 <w:noProof/>
               </w:rPr>
-              <w:instrText xml:space="preserve"> PAGEREF _Toc241535900 \h </w:instrText>
+              <w:instrText xml:space="preserve"> PAGEREF _Toc241537505 \h </w:instrText>
             </w:r>
             <w:r>
               <w:rPr>
@@ -803,7 +803,7 @@
               <w14:ligatures w14:val="standardContextual"/>
             </w:rPr>
           </w:pPr>
-          <w:hyperlink w:anchor="_Toc241535901" w:history="1">
+          <w:hyperlink w:anchor="_Toc241537506" w:history="1">
             <w:r>
               <w:rPr>
                 <w:rStyle w:val="Hipervnculo"/>
@@ -827,7 +827,7 @@
               <w:rPr>
                 <w:noProof/>
               </w:rPr>
-              <w:instrText xml:space="preserve"> PAGEREF _Toc241535901 \h </w:instrText>
+              <w:instrText xml:space="preserve"> PAGEREF _Toc241537506 \h </w:instrText>
             </w:r>
             <w:r>
               <w:rPr>
@@ -869,7 +869,7 @@
               <w14:ligatures w14:val="standardContextual"/>
             </w:rPr>
           </w:pPr>
-          <w:hyperlink w:anchor="_Toc241535902" w:history="1">
+          <w:hyperlink w:anchor="_Toc241537507" w:history="1">
             <w:r>
               <w:rPr>
                 <w:rStyle w:val="Hipervnculo"/>
@@ -893,7 +893,7 @@
               <w:rPr>
                 <w:noProof/>
               </w:rPr>
-              <w:instrText xml:space="preserve"> PAGEREF _Toc241535902 \h </w:instrText>
+              <w:instrText xml:space="preserve"> PAGEREF _Toc241537507 \h </w:instrText>
             </w:r>
             <w:r>
               <w:rPr>
@@ -935,7 +935,7 @@
               <w14:ligatures w14:val="standardContextual"/>
             </w:rPr>
           </w:pPr>
-          <w:hyperlink w:anchor="_Toc241535903" w:history="1">
+          <w:hyperlink w:anchor="_Toc241537508" w:history="1">
             <w:r>
               <w:rPr>
                 <w:rStyle w:val="Hipervnculo"/>
@@ -959,7 +959,7 @@
               <w:rPr>
                 <w:noProof/>
               </w:rPr>
-              <w:instrText xml:space="preserve"> PAGEREF _Toc241535903 \h </w:instrText>
+              <w:instrText xml:space="preserve"> PAGEREF _Toc241537508 \h </w:instrText>
             </w:r>
             <w:r>
               <w:rPr>
@@ -976,7 +976,7 @@
               <w:rPr>
                 <w:noProof/>
               </w:rPr>
-              <w:t>9</w:t>
+              <w:t>10</w:t>
             </w:r>
             <w:r>
               <w:rPr>
@@ -1001,7 +1001,7 @@
               <w14:ligatures w14:val="standardContextual"/>
             </w:rPr>
           </w:pPr>
-          <w:hyperlink w:anchor="_Toc241535904" w:history="1">
+          <w:hyperlink w:anchor="_Toc241537509" w:history="1">
             <w:r>
               <w:rPr>
                 <w:rStyle w:val="Hipervnculo"/>
@@ -1025,7 +1025,7 @@
               <w:rPr>
                 <w:noProof/>
               </w:rPr>
-              <w:instrText xml:space="preserve"> PAGEREF _Toc241535904 \h </w:instrText>
+              <w:instrText xml:space="preserve"> PAGEREF _Toc241537509 \h </w:instrText>
             </w:r>
             <w:r>
               <w:rPr>
@@ -1042,7 +1042,7 @@
               <w:rPr>
                 <w:noProof/>
               </w:rPr>
-              <w:t>10</w:t>
+              <w:t>11</w:t>
             </w:r>
             <w:r>
               <w:rPr>
@@ -1067,7 +1067,7 @@
               <w14:ligatures w14:val="standardContextual"/>
             </w:rPr>
           </w:pPr>
-          <w:hyperlink w:anchor="_Toc241535905" w:history="1">
+          <w:hyperlink w:anchor="_Toc241537510" w:history="1">
             <w:r>
               <w:rPr>
                 <w:rStyle w:val="Hipervnculo"/>
@@ -1091,7 +1091,7 @@
               <w:rPr>
                 <w:noProof/>
               </w:rPr>
-              <w:instrText xml:space="preserve"> PAGEREF _Toc241535905 \h </w:instrText>
+              <w:instrText xml:space="preserve"> PAGEREF _Toc241537510 \h </w:instrText>
             </w:r>
             <w:r>
               <w:rPr>
@@ -1108,7 +1108,7 @@
               <w:rPr>
                 <w:noProof/>
               </w:rPr>
-              <w:t>11</w:t>
+              <w:t>12</w:t>
             </w:r>
             <w:r>
               <w:rPr>
@@ -1133,7 +1133,7 @@
               <w14:ligatures w14:val="standardContextual"/>
             </w:rPr>
           </w:pPr>
-          <w:hyperlink w:anchor="_Toc241535906" w:history="1">
+          <w:hyperlink w:anchor="_Toc241537511" w:history="1">
             <w:r>
               <w:rPr>
                 <w:rStyle w:val="Hipervnculo"/>
@@ -1157,7 +1157,7 @@
               <w:rPr>
                 <w:noProof/>
               </w:rPr>
-              <w:instrText xml:space="preserve"> PAGEREF _Toc241535906 \h </w:instrText>
+              <w:instrText xml:space="preserve"> PAGEREF _Toc241537511 \h </w:instrText>
             </w:r>
             <w:r>
               <w:rPr>
@@ -1174,7 +1174,7 @@
               <w:rPr>
                 <w:noProof/>
               </w:rPr>
-              <w:t>11</w:t>
+              <w:t>12</w:t>
             </w:r>
             <w:r>
               <w:rPr>
@@ -1199,7 +1199,7 @@
               <w14:ligatures w14:val="standardContextual"/>
             </w:rPr>
           </w:pPr>
-          <w:hyperlink w:anchor="_Toc241535907" w:history="1">
+          <w:hyperlink w:anchor="_Toc241537512" w:history="1">
             <w:r>
               <w:rPr>
                 <w:rStyle w:val="Hipervnculo"/>
@@ -1223,7 +1223,7 @@
               <w:rPr>
                 <w:noProof/>
               </w:rPr>
-              <w:instrText xml:space="preserve"> PAGEREF _Toc241535907 \h </w:instrText>
+              <w:instrText xml:space="preserve"> PAGEREF _Toc241537512 \h </w:instrText>
             </w:r>
             <w:r>
               <w:rPr>
@@ -1240,7 +1240,7 @@
               <w:rPr>
                 <w:noProof/>
               </w:rPr>
-              <w:t>11</w:t>
+              <w:t>13</w:t>
             </w:r>
             <w:r>
               <w:rPr>
@@ -1265,7 +1265,7 @@
               <w14:ligatures w14:val="standardContextual"/>
             </w:rPr>
           </w:pPr>
-          <w:hyperlink w:anchor="_Toc241535908" w:history="1">
+          <w:hyperlink w:anchor="_Toc241537513" w:history="1">
             <w:r>
               <w:rPr>
                 <w:rStyle w:val="Hipervnculo"/>
@@ -1289,7 +1289,7 @@
               <w:rPr>
                 <w:noProof/>
               </w:rPr>
-              <w:instrText xml:space="preserve"> PAGEREF _Toc241535908 \h </w:instrText>
+              <w:instrText xml:space="preserve"> PAGEREF _Toc241537513 \h </w:instrText>
             </w:r>
             <w:r>
               <w:rPr>
@@ -1306,7 +1306,7 @@
               <w:rPr>
                 <w:noProof/>
               </w:rPr>
-              <w:t>11</w:t>
+              <w:t>13</w:t>
             </w:r>
             <w:r>
               <w:rPr>
@@ -1331,7 +1331,7 @@
               <w14:ligatures w14:val="standardContextual"/>
             </w:rPr>
           </w:pPr>
-          <w:hyperlink w:anchor="_Toc241535909" w:history="1">
+          <w:hyperlink w:anchor="_Toc241537514" w:history="1">
             <w:r>
               <w:rPr>
                 <w:rStyle w:val="Hipervnculo"/>
@@ -1355,7 +1355,7 @@
               <w:rPr>
                 <w:noProof/>
               </w:rPr>
-              <w:instrText xml:space="preserve"> PAGEREF _Toc241535909 \h </w:instrText>
+              <w:instrText xml:space="preserve"> PAGEREF _Toc241537514 \h </w:instrText>
             </w:r>
             <w:r>
               <w:rPr>
@@ -1372,7 +1372,7 @@
               <w:rPr>
                 <w:noProof/>
               </w:rPr>
-              <w:t>12</w:t>
+              <w:t>14</w:t>
             </w:r>
             <w:r>
               <w:rPr>
@@ -1397,7 +1397,7 @@
               <w14:ligatures w14:val="standardContextual"/>
             </w:rPr>
           </w:pPr>
-          <w:hyperlink w:anchor="_Toc241535910" w:history="1">
+          <w:hyperlink w:anchor="_Toc241537515" w:history="1">
             <w:r>
               <w:rPr>
                 <w:rStyle w:val="Hipervnculo"/>
@@ -1421,7 +1421,7 @@
               <w:rPr>
                 <w:noProof/>
               </w:rPr>
-              <w:instrText xml:space="preserve"> PAGEREF _Toc241535910 \h </w:instrText>
+              <w:instrText xml:space="preserve"> PAGEREF _Toc241537515 \h </w:instrText>
             </w:r>
             <w:r>
               <w:rPr>
@@ -1438,7 +1438,7 @@
               <w:rPr>
                 <w:noProof/>
               </w:rPr>
-              <w:t>12</w:t>
+              <w:t>14</w:t>
             </w:r>
             <w:r>
               <w:rPr>
@@ -1463,7 +1463,7 @@
               <w14:ligatures w14:val="standardContextual"/>
             </w:rPr>
           </w:pPr>
-          <w:hyperlink w:anchor="_Toc241535911" w:history="1">
+          <w:hyperlink w:anchor="_Toc241537516" w:history="1">
             <w:r>
               <w:rPr>
                 <w:rStyle w:val="Hipervnculo"/>
@@ -1487,7 +1487,7 @@
               <w:rPr>
                 <w:noProof/>
               </w:rPr>
-              <w:instrText xml:space="preserve"> PAGEREF _Toc241535911 \h </w:instrText>
+              <w:instrText xml:space="preserve"> PAGEREF _Toc241537516 \h </w:instrText>
             </w:r>
             <w:r>
               <w:rPr>
@@ -1504,7 +1504,7 @@
               <w:rPr>
                 <w:noProof/>
               </w:rPr>
-              <w:t>12</w:t>
+              <w:t>14</w:t>
             </w:r>
             <w:r>
               <w:rPr>
@@ -1530,7 +1530,7 @@
       <w:pPr>
         <w:pStyle w:val="Ttulo1"/>
       </w:pPr>
-      <w:bookmarkStart w:id="0" w:name="_Toc241535892"/>
+      <w:bookmarkStart w:id="0" w:name="_Toc241537497"/>
       <w:r>
         <w:lastRenderedPageBreak/>
         <w:t>1. Resumen ejecutivo</w:t>
@@ -1568,7 +1568,7 @@
           <w:left w:w="10" w:type="dxa"/>
           <w:right w:w="10" w:type="dxa"/>
         </w:tblCellMar>
-        <w:tblLook w:val="04A0" w:firstRow="1" w:lastRow="0" w:firstColumn="1" w:lastColumn="0" w:noHBand="0" w:noVBand="1"/>
+        <w:tblLook w:val="0000" w:firstRow="0" w:lastRow="0" w:firstColumn="0" w:lastColumn="0" w:noHBand="0" w:noVBand="0"/>
       </w:tblPr>
       <w:tblGrid>
         <w:gridCol w:w="2900"/>
@@ -2223,7 +2223,7 @@
       <w:pPr>
         <w:pStyle w:val="Ttulo1"/>
       </w:pPr>
-      <w:bookmarkStart w:id="1" w:name="_Toc241535893"/>
+      <w:bookmarkStart w:id="1" w:name="_Toc241537498"/>
       <w:r>
         <w:t>2. Alcance y solución implementada</w:t>
       </w:r>
@@ -2233,7 +2233,7 @@
       <w:pPr>
         <w:pStyle w:val="Ttulo2"/>
       </w:pPr>
-      <w:bookmarkStart w:id="2" w:name="_Toc241535894"/>
+      <w:bookmarkStart w:id="2" w:name="_Toc241537499"/>
       <w:r>
         <w:t>2.1 Roles del sistema</w:t>
       </w:r>
@@ -2254,7 +2254,7 @@
           <w:left w:w="10" w:type="dxa"/>
           <w:right w:w="10" w:type="dxa"/>
         </w:tblCellMar>
-        <w:tblLook w:val="04A0" w:firstRow="1" w:lastRow="0" w:firstColumn="1" w:lastColumn="0" w:noHBand="0" w:noVBand="1"/>
+        <w:tblLook w:val="0000" w:firstRow="0" w:lastRow="0" w:firstColumn="0" w:lastColumn="0" w:noHBand="0" w:noVBand="0"/>
       </w:tblPr>
       <w:tblGrid>
         <w:gridCol w:w="1800"/>
@@ -2529,7 +2529,7 @@
       <w:pPr>
         <w:pStyle w:val="Ttulo2"/>
       </w:pPr>
-      <w:bookmarkStart w:id="3" w:name="_Toc241535895"/>
+      <w:bookmarkStart w:id="3" w:name="_Toc241537500"/>
       <w:r>
         <w:t>2.2 Ruta guiada por rol</w:t>
       </w:r>
@@ -2553,7 +2553,7 @@
         </w:rPr>
         <w:lastRenderedPageBreak/>
         <w:drawing>
-          <wp:inline distT="0" distB="0" distL="0" distR="0" wp14:anchorId="09C6A018" wp14:editId="23F85F4F">
+          <wp:inline distT="0" distB="0" distL="0" distR="0" wp14:anchorId="6E2D7C62" wp14:editId="6209BEA6">
             <wp:extent cx="5334000" cy="3333750"/>
             <wp:effectExtent l="0" t="0" r="0" b="0"/>
             <wp:docPr id="1" name="ruta-guiada-admin.png" descr="ruta-guiada-admin.png" title="ruta-guiada-admin.png"/>
@@ -2612,7 +2612,7 @@
       <w:pPr>
         <w:pStyle w:val="Ttulo2"/>
       </w:pPr>
-      <w:bookmarkStart w:id="4" w:name="_Toc241535896"/>
+      <w:bookmarkStart w:id="4" w:name="_Toc241537501"/>
       <w:r>
         <w:t>2.3 Flujo de una donación</w:t>
       </w:r>
@@ -2630,7 +2630,7 @@
       <w:pPr>
         <w:pStyle w:val="Ttulo2"/>
       </w:pPr>
-      <w:bookmarkStart w:id="5" w:name="_Toc241535897"/>
+      <w:bookmarkStart w:id="5" w:name="_Toc241537502"/>
       <w:r>
         <w:t>2.4 Arquitectura y decisiones técnicas</w:t>
       </w:r>
@@ -2731,7 +2731,7 @@
         </w:rPr>
         <w:lastRenderedPageBreak/>
         <w:drawing>
-          <wp:inline distT="0" distB="0" distL="0" distR="0" wp14:anchorId="0A6D2215" wp14:editId="17C144F1">
+          <wp:inline distT="0" distB="0" distL="0" distR="0" wp14:anchorId="2AE3DAAC" wp14:editId="0248AF56">
             <wp:extent cx="5715000" cy="4105275"/>
             <wp:effectExtent l="0" t="0" r="0" b="0"/>
             <wp:docPr id="2" name="desk-donador-panel.png" descr="desk-donador-panel.png" title="desk-donador-panel.png"/>
@@ -2795,7 +2795,7 @@
           <w:noProof/>
         </w:rPr>
         <w:drawing>
-          <wp:inline distT="0" distB="0" distL="0" distR="0" wp14:anchorId="6C7E85B3" wp14:editId="4CDC0E0D">
+          <wp:inline distT="0" distB="0" distL="0" distR="0" wp14:anchorId="397B2838" wp14:editId="44C2CC1B">
             <wp:extent cx="5715000" cy="3571875"/>
             <wp:effectExtent l="0" t="0" r="0" b="0"/>
             <wp:docPr id="3" name="desk-admin-solicitudes.png" descr="desk-admin-solicitudes.png" title="desk-admin-solicitudes.png"/>
@@ -2860,7 +2860,7 @@
       <w:pPr>
         <w:pStyle w:val="Ttulo1"/>
       </w:pPr>
-      <w:bookmarkStart w:id="6" w:name="_Toc241535898"/>
+      <w:bookmarkStart w:id="6" w:name="_Toc241537503"/>
       <w:r>
         <w:lastRenderedPageBreak/>
         <w:t>3. Comparación entre lo planificado y lo ejecutado</w:t>
@@ -2890,7 +2890,7 @@
           <w:left w:w="10" w:type="dxa"/>
           <w:right w:w="10" w:type="dxa"/>
         </w:tblCellMar>
-        <w:tblLook w:val="04A0" w:firstRow="1" w:lastRow="0" w:firstColumn="1" w:lastColumn="0" w:noHBand="0" w:noVBand="1"/>
+        <w:tblLook w:val="0000" w:firstRow="0" w:lastRow="0" w:firstColumn="0" w:lastColumn="0" w:noHBand="0" w:noVBand="0"/>
       </w:tblPr>
       <w:tblGrid>
         <w:gridCol w:w="1500"/>
@@ -4825,7 +4825,7 @@
           <w:left w:w="10" w:type="dxa"/>
           <w:right w:w="10" w:type="dxa"/>
         </w:tblCellMar>
-        <w:tblLook w:val="04A0" w:firstRow="1" w:lastRow="0" w:firstColumn="1" w:lastColumn="0" w:noHBand="0" w:noVBand="1"/>
+        <w:tblLook w:val="0000" w:firstRow="0" w:lastRow="0" w:firstColumn="0" w:lastColumn="0" w:noHBand="0" w:noVBand="0"/>
       </w:tblPr>
       <w:tblGrid>
         <w:gridCol w:w="3960"/>
@@ -5438,7 +5438,7 @@
       <w:pPr>
         <w:pStyle w:val="Ttulo2"/>
       </w:pPr>
-      <w:bookmarkStart w:id="7" w:name="_Toc241535899"/>
+      <w:bookmarkStart w:id="7" w:name="_Toc241537504"/>
       <w:r>
         <w:lastRenderedPageBreak/>
         <w:t>3.1 Alcance planificado frente al entregado</w:t>
@@ -5460,7 +5460,7 @@
           <w:left w:w="10" w:type="dxa"/>
           <w:right w:w="10" w:type="dxa"/>
         </w:tblCellMar>
-        <w:tblLook w:val="04A0" w:firstRow="1" w:lastRow="0" w:firstColumn="1" w:lastColumn="0" w:noHBand="0" w:noVBand="1"/>
+        <w:tblLook w:val="0000" w:firstRow="0" w:lastRow="0" w:firstColumn="0" w:lastColumn="0" w:noHBand="0" w:noVBand="0"/>
       </w:tblPr>
       <w:tblGrid>
         <w:gridCol w:w="1900"/>
@@ -6294,7 +6294,7 @@
       <w:pPr>
         <w:pStyle w:val="Ttulo2"/>
       </w:pPr>
-      <w:bookmarkStart w:id="8" w:name="_Toc241535900"/>
+      <w:bookmarkStart w:id="8" w:name="_Toc241537505"/>
       <w:r>
         <w:t>3.2 Incidentes que afectaron el cronograma</w:t>
       </w:r>
@@ -6429,7 +6429,7 @@
       <w:pPr>
         <w:pStyle w:val="Ttulo1"/>
       </w:pPr>
-      <w:bookmarkStart w:id="9" w:name="_Toc241535901"/>
+      <w:bookmarkStart w:id="9" w:name="_Toc241537506"/>
       <w:r>
         <w:lastRenderedPageBreak/>
         <w:t>4. Resultados de pruebas y calidad</w:t>
@@ -6440,7 +6440,7 @@
       <w:pPr>
         <w:pStyle w:val="Ttulo2"/>
       </w:pPr>
-      <w:bookmarkStart w:id="10" w:name="_Toc241535902"/>
+      <w:bookmarkStart w:id="10" w:name="_Toc241537507"/>
       <w:r>
         <w:t>4.1 Pruebas unitarias y de integración (Jest + Supertest)</w:t>
       </w:r>
@@ -6461,7 +6461,7 @@
           <w:left w:w="10" w:type="dxa"/>
           <w:right w:w="10" w:type="dxa"/>
         </w:tblCellMar>
-        <w:tblLook w:val="04A0" w:firstRow="1" w:lastRow="0" w:firstColumn="1" w:lastColumn="0" w:noHBand="0" w:noVBand="1"/>
+        <w:tblLook w:val="0000" w:firstRow="0" w:lastRow="0" w:firstColumn="0" w:lastColumn="0" w:noHBand="0" w:noVBand="0"/>
       </w:tblPr>
       <w:tblGrid>
         <w:gridCol w:w="3960"/>
@@ -6943,9 +6943,138 @@
     </w:p>
     <w:p>
       <w:pPr>
+        <w:jc w:val="center"/>
+      </w:pPr>
+      <w:r>
+        <w:rPr>
+          <w:noProof/>
+        </w:rPr>
+        <w:drawing>
+          <wp:inline distT="0" distB="0" distL="0" distR="0" wp14:anchorId="001CF789" wp14:editId="7251006F">
+            <wp:extent cx="5715000" cy="4057650"/>
+            <wp:effectExtent l="0" t="0" r="0" b="0"/>
+            <wp:docPr id="4" name="evidencia/jest-tests.png" descr="evidencia/jest-tests.png" title="evidencia/jest-tests.png"/>
+            <wp:cNvGraphicFramePr>
+              <a:graphicFrameLocks xmlns:a="http://schemas.openxmlformats.org/drawingml/2006/main" noChangeAspect="1"/>
+            </wp:cNvGraphicFramePr>
+            <a:graphic xmlns:a="http://schemas.openxmlformats.org/drawingml/2006/main">
+              <a:graphicData uri="http://schemas.openxmlformats.org/drawingml/2006/picture">
+                <pic:pic xmlns:pic="http://schemas.openxmlformats.org/drawingml/2006/picture">
+                  <pic:nvPicPr>
+                    <pic:cNvPr id="0" name=""/>
+                    <pic:cNvPicPr>
+                      <a:picLocks noChangeAspect="1" noChangeArrowheads="1"/>
+                    </pic:cNvPicPr>
+                  </pic:nvPicPr>
+                  <pic:blipFill>
+                    <a:blip r:embed="rId10"/>
+                    <a:srcRect/>
+                    <a:stretch>
+                      <a:fillRect/>
+                    </a:stretch>
+                  </pic:blipFill>
+                  <pic:spPr bwMode="auto">
+                    <a:xfrm>
+                      <a:off x="0" y="0"/>
+                      <a:ext cx="5715000" cy="4057650"/>
+                    </a:xfrm>
+                    <a:prstGeom prst="rect">
+                      <a:avLst/>
+                    </a:prstGeom>
+                  </pic:spPr>
+                </pic:pic>
+              </a:graphicData>
+            </a:graphic>
+          </wp:inline>
+        </w:drawing>
+      </w:r>
+    </w:p>
+    <w:p>
+      <w:pPr>
+        <w:spacing w:before="60" w:after="200"/>
+        <w:jc w:val="center"/>
+      </w:pPr>
+      <w:r>
+        <w:rPr>
+          <w:i/>
+          <w:iCs/>
+          <w:color w:val="6B6A76"/>
+          <w:sz w:val="18"/>
+          <w:szCs w:val="18"/>
+        </w:rPr>
+        <w:t>Figura 4. Evidencia real: salida de Jest con los 7 archivos de prueba en PASS y 131 pruebas aprobadas.</w:t>
+      </w:r>
+    </w:p>
+    <w:p>
+      <w:pPr>
+        <w:jc w:val="center"/>
+      </w:pPr>
+      <w:r>
+        <w:rPr>
+          <w:noProof/>
+        </w:rPr>
+        <w:lastRenderedPageBreak/>
+        <w:drawing>
+          <wp:inline distT="0" distB="0" distL="0" distR="0" wp14:anchorId="288A8EF9" wp14:editId="669BB6DA">
+            <wp:extent cx="5334000" cy="4267200"/>
+            <wp:effectExtent l="0" t="0" r="0" b="0"/>
+            <wp:docPr id="5" name="evidencia/jest-coverage.png" descr="evidencia/jest-coverage.png" title="evidencia/jest-coverage.png"/>
+            <wp:cNvGraphicFramePr>
+              <a:graphicFrameLocks xmlns:a="http://schemas.openxmlformats.org/drawingml/2006/main" noChangeAspect="1"/>
+            </wp:cNvGraphicFramePr>
+            <a:graphic xmlns:a="http://schemas.openxmlformats.org/drawingml/2006/main">
+              <a:graphicData uri="http://schemas.openxmlformats.org/drawingml/2006/picture">
+                <pic:pic xmlns:pic="http://schemas.openxmlformats.org/drawingml/2006/picture">
+                  <pic:nvPicPr>
+                    <pic:cNvPr id="0" name=""/>
+                    <pic:cNvPicPr>
+                      <a:picLocks noChangeAspect="1" noChangeArrowheads="1"/>
+                    </pic:cNvPicPr>
+                  </pic:nvPicPr>
+                  <pic:blipFill>
+                    <a:blip r:embed="rId11"/>
+                    <a:srcRect/>
+                    <a:stretch>
+                      <a:fillRect/>
+                    </a:stretch>
+                  </pic:blipFill>
+                  <pic:spPr bwMode="auto">
+                    <a:xfrm>
+                      <a:off x="0" y="0"/>
+                      <a:ext cx="5334000" cy="4267200"/>
+                    </a:xfrm>
+                    <a:prstGeom prst="rect">
+                      <a:avLst/>
+                    </a:prstGeom>
+                  </pic:spPr>
+                </pic:pic>
+              </a:graphicData>
+            </a:graphic>
+          </wp:inline>
+        </w:drawing>
+      </w:r>
+    </w:p>
+    <w:p>
+      <w:pPr>
+        <w:spacing w:before="60" w:after="200"/>
+        <w:jc w:val="center"/>
+      </w:pPr>
+      <w:r>
+        <w:rPr>
+          <w:i/>
+          <w:iCs/>
+          <w:color w:val="6B6A76"/>
+          <w:sz w:val="18"/>
+          <w:szCs w:val="18"/>
+        </w:rPr>
+        <w:t>Figura 5. Evidencia real: reporte de cobertura de Jest por archivo (99.84 % de líneas).</w:t>
+      </w:r>
+    </w:p>
+    <w:p>
+      <w:pPr>
         <w:pStyle w:val="Ttulo2"/>
       </w:pPr>
-      <w:bookmarkStart w:id="11" w:name="_Toc241535903"/>
+      <w:bookmarkStart w:id="11" w:name="_Toc241537508"/>
       <w:r>
         <w:t>4.2 Pruebas de seguridad (OWASP ZAP)</w:t>
       </w:r>
@@ -6974,7 +7103,7 @@
           <w:left w:w="10" w:type="dxa"/>
           <w:right w:w="10" w:type="dxa"/>
         </w:tblCellMar>
-        <w:tblLook w:val="04A0" w:firstRow="1" w:lastRow="0" w:firstColumn="1" w:lastColumn="0" w:noHBand="0" w:noVBand="1"/>
+        <w:tblLook w:val="0000" w:firstRow="0" w:lastRow="0" w:firstColumn="0" w:lastColumn="0" w:noHBand="0" w:noVBand="0"/>
       </w:tblPr>
       <w:tblGrid>
         <w:gridCol w:w="3960"/>
@@ -7461,7 +7590,7 @@
           <w:left w:w="10" w:type="dxa"/>
           <w:right w:w="10" w:type="dxa"/>
         </w:tblCellMar>
-        <w:tblLook w:val="04A0" w:firstRow="1" w:lastRow="0" w:firstColumn="1" w:lastColumn="0" w:noHBand="0" w:noVBand="1"/>
+        <w:tblLook w:val="0000" w:firstRow="0" w:lastRow="0" w:firstColumn="0" w:lastColumn="0" w:noHBand="0" w:noVBand="0"/>
       </w:tblPr>
       <w:tblGrid>
         <w:gridCol w:w="3600"/>
@@ -7685,6 +7814,7 @@
                 <w:sz w:val="18"/>
                 <w:szCs w:val="18"/>
               </w:rPr>
+              <w:lastRenderedPageBreak/>
               <w:t>Information Disclosure – Suspicious Comments (dom.js)</w:t>
             </w:r>
           </w:p>
@@ -8015,7 +8145,7 @@
       <w:pPr>
         <w:pStyle w:val="Ttulo2"/>
       </w:pPr>
-      <w:bookmarkStart w:id="12" w:name="_Toc241535904"/>
+      <w:bookmarkStart w:id="12" w:name="_Toc241537509"/>
       <w:r>
         <w:t>4.3 Análisis de calidad del código (SonarQube)</w:t>
       </w:r>
@@ -8036,7 +8166,7 @@
           <w:left w:w="10" w:type="dxa"/>
           <w:right w:w="10" w:type="dxa"/>
         </w:tblCellMar>
-        <w:tblLook w:val="04A0" w:firstRow="1" w:lastRow="0" w:firstColumn="1" w:lastColumn="0" w:noHBand="0" w:noVBand="1"/>
+        <w:tblLook w:val="0000" w:firstRow="0" w:lastRow="0" w:firstColumn="0" w:lastColumn="0" w:noHBand="0" w:noVBand="0"/>
       </w:tblPr>
       <w:tblGrid>
         <w:gridCol w:w="3960"/>
@@ -9418,11 +9548,147 @@
     </w:p>
     <w:p>
       <w:pPr>
+        <w:jc w:val="center"/>
+      </w:pPr>
+      <w:r>
+        <w:rPr>
+          <w:noProof/>
+        </w:rPr>
+        <w:lastRenderedPageBreak/>
+        <w:drawing>
+          <wp:inline distT="0" distB="0" distL="0" distR="0" wp14:anchorId="7EC2C593" wp14:editId="11228653">
+            <wp:extent cx="5715000" cy="2857500"/>
+            <wp:effectExtent l="0" t="0" r="0" b="0"/>
+            <wp:docPr id="6" name="evidencia/sonar-overview.png" descr="evidencia/sonar-overview.png" title="evidencia/sonar-overview.png"/>
+            <wp:cNvGraphicFramePr>
+              <a:graphicFrameLocks xmlns:a="http://schemas.openxmlformats.org/drawingml/2006/main" noChangeAspect="1"/>
+            </wp:cNvGraphicFramePr>
+            <a:graphic xmlns:a="http://schemas.openxmlformats.org/drawingml/2006/main">
+              <a:graphicData uri="http://schemas.openxmlformats.org/drawingml/2006/picture">
+                <pic:pic xmlns:pic="http://schemas.openxmlformats.org/drawingml/2006/picture">
+                  <pic:nvPicPr>
+                    <pic:cNvPr id="0" name=""/>
+                    <pic:cNvPicPr>
+                      <a:picLocks noChangeAspect="1" noChangeArrowheads="1"/>
+                    </pic:cNvPicPr>
+                  </pic:nvPicPr>
+                  <pic:blipFill>
+                    <a:blip r:embed="rId12"/>
+                    <a:srcRect/>
+                    <a:stretch>
+                      <a:fillRect/>
+                    </a:stretch>
+                  </pic:blipFill>
+                  <pic:spPr bwMode="auto">
+                    <a:xfrm>
+                      <a:off x="0" y="0"/>
+                      <a:ext cx="5715000" cy="2857500"/>
+                    </a:xfrm>
+                    <a:prstGeom prst="rect">
+                      <a:avLst/>
+                    </a:prstGeom>
+                  </pic:spPr>
+                </pic:pic>
+              </a:graphicData>
+            </a:graphic>
+          </wp:inline>
+        </w:drawing>
+      </w:r>
+    </w:p>
+    <w:p>
+      <w:pPr>
+        <w:spacing w:before="60" w:after="200"/>
+        <w:jc w:val="center"/>
+      </w:pPr>
+      <w:r>
+        <w:rPr>
+          <w:i/>
+          <w:iCs/>
+          <w:color w:val="6B6A76"/>
+          <w:sz w:val="18"/>
+          <w:szCs w:val="18"/>
+        </w:rPr>
+        <w:t>Figura 6. Evidencia real: tablero de SonarQube con Quality Gate aprobado y calificación A en seguridad, fiabilidad y mantenibilidad.</w:t>
+      </w:r>
+    </w:p>
+    <w:p>
+      <w:pPr>
+        <w:jc w:val="center"/>
+      </w:pPr>
+      <w:r>
+        <w:rPr>
+          <w:noProof/>
+        </w:rPr>
+        <w:drawing>
+          <wp:inline distT="0" distB="0" distL="0" distR="0" wp14:anchorId="7487E39C" wp14:editId="1C33C020">
+            <wp:extent cx="4572000" cy="2495550"/>
+            <wp:effectExtent l="0" t="0" r="0" b="0"/>
+            <wp:docPr id="7" name="evidencia/sonar-issues.png" descr="evidencia/sonar-issues.png" title="evidencia/sonar-issues.png"/>
+            <wp:cNvGraphicFramePr>
+              <a:graphicFrameLocks xmlns:a="http://schemas.openxmlformats.org/drawingml/2006/main" noChangeAspect="1"/>
+            </wp:cNvGraphicFramePr>
+            <a:graphic xmlns:a="http://schemas.openxmlformats.org/drawingml/2006/main">
+              <a:graphicData uri="http://schemas.openxmlformats.org/drawingml/2006/picture">
+                <pic:pic xmlns:pic="http://schemas.openxmlformats.org/drawingml/2006/picture">
+                  <pic:nvPicPr>
+                    <pic:cNvPr id="0" name=""/>
+                    <pic:cNvPicPr>
+                      <a:picLocks noChangeAspect="1" noChangeArrowheads="1"/>
+                    </pic:cNvPicPr>
+                  </pic:nvPicPr>
+                  <pic:blipFill>
+                    <a:blip r:embed="rId13"/>
+                    <a:srcRect/>
+                    <a:stretch>
+                      <a:fillRect/>
+                    </a:stretch>
+                  </pic:blipFill>
+                  <pic:spPr bwMode="auto">
+                    <a:xfrm>
+                      <a:off x="0" y="0"/>
+                      <a:ext cx="4572000" cy="2495550"/>
+                    </a:xfrm>
+                    <a:prstGeom prst="rect">
+                      <a:avLst/>
+                    </a:prstGeom>
+                  </pic:spPr>
+                </pic:pic>
+              </a:graphicData>
+            </a:graphic>
+          </wp:inline>
+        </w:drawing>
+      </w:r>
+    </w:p>
+    <w:p>
+      <w:pPr>
+        <w:spacing w:before="60" w:after="200"/>
+        <w:jc w:val="center"/>
+      </w:pPr>
+      <w:r>
+        <w:rPr>
+          <w:i/>
+          <w:iCs/>
+          <w:color w:val="6B6A76"/>
+          <w:sz w:val="18"/>
+          <w:szCs w:val="18"/>
+        </w:rPr>
+        <w:t>Figura 7. Evidencia real: lista de incidencias de SonarQube vacía («No Issues»).</w:t>
+      </w:r>
+    </w:p>
+    <w:p>
+      <w:pPr>
+        <w:spacing w:after="120" w:line="276" w:lineRule="auto"/>
+      </w:pPr>
+      <w:r>
+        <w:t>Nota: la edición gratuita de SonarQube no analiza vulnerabilidades de inyección (SQL, XSS); por eso esas pruebas se cubrieron con OWASP ZAP (sección 4.2).</w:t>
+      </w:r>
+    </w:p>
+    <w:p>
+      <w:pPr>
         <w:pStyle w:val="Ttulo1"/>
       </w:pPr>
-      <w:bookmarkStart w:id="13" w:name="_Toc241535905"/>
+      <w:bookmarkStart w:id="13" w:name="_Toc241537510"/>
       <w:r>
-        <w:lastRenderedPageBreak/>
         <w:t>5. Lecciones aprendidas</w:t>
       </w:r>
       <w:bookmarkEnd w:id="13"/>
@@ -9431,7 +9697,7 @@
       <w:pPr>
         <w:pStyle w:val="Ttulo2"/>
       </w:pPr>
-      <w:bookmarkStart w:id="14" w:name="_Toc241535906"/>
+      <w:bookmarkStart w:id="14" w:name="_Toc241537511"/>
       <w:r>
         <w:t>5.1 Durante la planificación</w:t>
       </w:r>
@@ -9491,6 +9757,7 @@
           <w:b/>
           <w:bCs/>
         </w:rPr>
+        <w:lastRenderedPageBreak/>
         <w:t xml:space="preserve">Las restricciones del cliente definen la arquitectura. </w:t>
       </w:r>
       <w:r>
@@ -9541,7 +9808,7 @@
       <w:pPr>
         <w:pStyle w:val="Ttulo2"/>
       </w:pPr>
-      <w:bookmarkStart w:id="15" w:name="_Toc241535907"/>
+      <w:bookmarkStart w:id="15" w:name="_Toc241537512"/>
       <w:r>
         <w:t>5.2 Durante la implementación</w:t>
       </w:r>
@@ -9671,7 +9938,7 @@
       <w:pPr>
         <w:pStyle w:val="Ttulo1"/>
       </w:pPr>
-      <w:bookmarkStart w:id="16" w:name="_Toc241535908"/>
+      <w:bookmarkStart w:id="16" w:name="_Toc241537513"/>
       <w:r>
         <w:t>6. Plan de mejora continua</w:t>
       </w:r>
@@ -9700,7 +9967,7 @@
           <w:left w:w="10" w:type="dxa"/>
           <w:right w:w="10" w:type="dxa"/>
         </w:tblCellMar>
-        <w:tblLook w:val="04A0" w:firstRow="1" w:lastRow="0" w:firstColumn="1" w:lastColumn="0" w:noHBand="0" w:noVBand="1"/>
+        <w:tblLook w:val="0000" w:firstRow="0" w:lastRow="0" w:firstColumn="0" w:lastColumn="0" w:noHBand="0" w:noVBand="0"/>
       </w:tblPr>
       <w:tblGrid>
         <w:gridCol w:w="400"/>
@@ -10180,7 +10447,6 @@
                 <w:sz w:val="18"/>
                 <w:szCs w:val="18"/>
               </w:rPr>
-              <w:lastRenderedPageBreak/>
               <w:t>3</w:t>
             </w:r>
           </w:p>
@@ -10601,6 +10867,7 @@
                 <w:sz w:val="18"/>
                 <w:szCs w:val="18"/>
               </w:rPr>
+              <w:lastRenderedPageBreak/>
               <w:t>6</w:t>
             </w:r>
           </w:p>
@@ -10862,7 +11129,7 @@
       <w:pPr>
         <w:pStyle w:val="Ttulo2"/>
       </w:pPr>
-      <w:bookmarkStart w:id="17" w:name="_Toc241535909"/>
+      <w:bookmarkStart w:id="17" w:name="_Toc241537514"/>
       <w:r>
         <w:t>6.1 Propuestas de innovación</w:t>
       </w:r>
@@ -10952,7 +11219,7 @@
       <w:pPr>
         <w:pStyle w:val="Ttulo2"/>
       </w:pPr>
-      <w:bookmarkStart w:id="18" w:name="_Toc241535910"/>
+      <w:bookmarkStart w:id="18" w:name="_Toc241537515"/>
       <w:r>
         <w:t>6.2 Seguimiento</w:t>
       </w:r>
@@ -10970,7 +11237,7 @@
       <w:pPr>
         <w:pStyle w:val="Ttulo1"/>
       </w:pPr>
-      <w:bookmarkStart w:id="19" w:name="_Toc241535911"/>
+      <w:bookmarkStart w:id="19" w:name="_Toc241537516"/>
       <w:r>
         <w:t>7. Conclusiones</w:t>
       </w:r>
@@ -10984,16 +11251,12 @@
         <w:t>El proyecto cumplió los objetivos de las tres fases. El sistema es funcional, tiene autenticación y autorización robustas, 131 pruebas automatizadas con 99.84 % de cobertura y un pipeline CI/CD que despliega automáticamente en un entorno de prueba y bloquea cualquier cambio que no pase las pruebas, el análisis de calidad o el escaneo de seguridad. El esfuerzo superó el plan en +33 % por la ampliación del alcance a tres roles, la interfaz y la ruta guiada solicitada por el cliente, pero esa inversión dio com</w:t>
       </w:r>
       <w:r>
-        <w:t xml:space="preserve">o resultado un producto </w:t>
-      </w:r>
-      <w:r>
-        <w:lastRenderedPageBreak/>
-        <w:t>más completo y seguro. El plan de mejora continua define los siguientes pasos con metas medibles, incluida la incorporación de inteligencia artificial para predecir donaciones.</w:t>
+        <w:t>o resultado un producto más completo y seguro. El plan de mejora continua define los siguientes pasos con metas medibles, incluida la incorporación de inteligencia artificial para predecir donaciones.</w:t>
       </w:r>
     </w:p>
     <w:sectPr>
-      <w:headerReference w:type="default" r:id="rId10"/>
-      <w:footerReference w:type="default" r:id="rId11"/>
+      <w:headerReference w:type="default" r:id="rId14"/>
+      <w:footerReference w:type="default" r:id="rId15"/>
       <w:pgSz w:w="12240" w:h="15840"/>
       <w:pgMar w:top="1440" w:right="1440" w:bottom="1440" w:left="1440" w:header="708" w:footer="708" w:gutter="0"/>
       <w:cols w:space="720"/>
@@ -11121,10 +11384,10 @@
 <file path=word/numbering.xml><?xml version="1.0" encoding="utf-8"?>
 <w:numbering xmlns:wpc="http://schemas.microsoft.com/office/word/2010/wordprocessingCanvas" xmlns:cx="http://schemas.microsoft.com/office/drawing/2014/chartex" xmlns:cx1="http://schemas.microsoft.com/office/drawing/2015/9/8/chartex" xmlns:cx2="http://schemas.microsoft.com/office/drawing/2015/10/21/chartex" xmlns:cx3="http://schemas.microsoft.com/office/drawing/2016/5/9/chartex" xmlns:cx4="http://schemas.microsoft.com/office/drawing/2016/5/10/chartex" xmlns:cx5="http://schemas.microsoft.com/office/drawing/2016/5/11/chartex" xmlns:cx6="http://schemas.microsoft.com/office/drawing/2016/5/12/chartex" xmlns:cx7="http://schemas.microsoft.com/office/drawing/2016/5/13/chartex" xmlns:cx8="http://schemas.microsoft.com/office/drawing/2016/5/14/chartex" xmlns:mc="http://schemas.openxmlformats.org/markup-compatibility/2006" xmlns:aink="http://schemas.microsoft.com/office/drawing/2016/ink" xmlns:am3d="http://schemas.microsoft.com/office/drawing/2017/model3d" xmlns:o="urn:schemas-microsoft-com:office:office" xmlns:oel="http://schemas.microsoft.com/office/2019/extlst" xmlns:r="http://schemas.openxmlformats.org/officeDocument/2006/relationships" xmlns:m="http://schemas.openxmlformats.org/officeDocument/2006/math" xmlns:v="urn:schemas-microsoft-com:vml" xmlns:wp14="http://schemas.microsoft.com/office/word/2010/wordprocessingDrawing" xmlns:wp="http://schemas.openxmlformats.org/drawingml/2006/wordprocessingDrawing" xmlns:w10="urn:schemas-microsoft-com:office:word" xmlns:w="http://schemas.openxmlformats.org/wordprocessingml/2006/main" xmlns:w14="http://schemas.microsoft.com/office/word/2010/wordml" xmlns:w15="http://schemas.microsoft.com/office/word/2012/wordml" xmlns:w16cex="http://schemas.microsoft.com/office/word/2018/wordml/cex" xmlns:w16cid="http://schemas.microsoft.com/office/word/2016/wordml/cid" xmlns:w16="http://schemas.microsoft.com/office/word/2018/wordml" xmlns:w16du="http://schemas.microsoft.com/office/word/2023/wordml/word16du" xmlns:w16sdtdh="http://schemas.microsoft.com/office/word/2020/wordml/sdtdatahash" xmlns:w16sdtfl="http://schemas.microsoft.com/office/word/2024/wordml/sdtformatlock" xmlns:w16se="http://schemas.microsoft.com/office/word/2015/wordml/symex" xmlns:wpg="http://schemas.microsoft.com/office/word/2010/wordprocessingGroup" xmlns:wpi="http://schemas.microsoft.com/office/word/2010/wordprocessingInk" xmlns:wne="http://schemas.microsoft.com/office/word/2006/wordml" xmlns:wps="http://schemas.microsoft.com/office/word/2010/wordprocessingShape" mc:Ignorable="w14 w15 w16se w16cid w16 w16cex w16sdtdh w16sdtfl w16du wp14">
   <w:abstractNum w:abstractNumId="0" w15:restartNumberingAfterBreak="0">
-    <w:nsid w:val="07D950B9"/>
+    <w:nsid w:val="26605928"/>
     <w:multiLevelType w:val="hybridMultilevel"/>
-    <w:tmpl w:val="3D5083F6"/>
-    <w:lvl w:ilvl="0" w:tplc="F44E0F48">
+    <w:tmpl w:val="45460D64"/>
+    <w:lvl w:ilvl="0" w:tplc="F3E2B498">
       <w:start w:val="1"/>
       <w:numFmt w:val="bullet"/>
       <w:lvlText w:val="•"/>
@@ -11133,52 +11396,52 @@
         <w:ind w:left="540" w:hanging="270"/>
       </w:pPr>
     </w:lvl>
-    <w:lvl w:ilvl="1" w:tplc="B5D2BF46">
+    <w:lvl w:ilvl="1" w:tplc="DA2427DC">
       <w:numFmt w:val="decimal"/>
       <w:lvlText w:val=""/>
       <w:lvlJc w:val="left"/>
     </w:lvl>
-    <w:lvl w:ilvl="2" w:tplc="902C8D44">
+    <w:lvl w:ilvl="2" w:tplc="A9FC9B36">
       <w:numFmt w:val="decimal"/>
       <w:lvlText w:val=""/>
       <w:lvlJc w:val="left"/>
     </w:lvl>
-    <w:lvl w:ilvl="3" w:tplc="08805F44">
+    <w:lvl w:ilvl="3" w:tplc="FD72B2CC">
       <w:numFmt w:val="decimal"/>
       <w:lvlText w:val=""/>
       <w:lvlJc w:val="left"/>
     </w:lvl>
-    <w:lvl w:ilvl="4" w:tplc="2D4AF7D4">
+    <w:lvl w:ilvl="4" w:tplc="E34A0D4E">
       <w:numFmt w:val="decimal"/>
       <w:lvlText w:val=""/>
       <w:lvlJc w:val="left"/>
     </w:lvl>
-    <w:lvl w:ilvl="5" w:tplc="0C5C704C">
+    <w:lvl w:ilvl="5" w:tplc="E508F694">
       <w:numFmt w:val="decimal"/>
       <w:lvlText w:val=""/>
       <w:lvlJc w:val="left"/>
     </w:lvl>
-    <w:lvl w:ilvl="6" w:tplc="A0AA1B70">
+    <w:lvl w:ilvl="6" w:tplc="50DEE70A">
       <w:numFmt w:val="decimal"/>
       <w:lvlText w:val=""/>
       <w:lvlJc w:val="left"/>
     </w:lvl>
-    <w:lvl w:ilvl="7" w:tplc="176CCDF8">
+    <w:lvl w:ilvl="7" w:tplc="E7369FE0">
       <w:numFmt w:val="decimal"/>
       <w:lvlText w:val=""/>
       <w:lvlJc w:val="left"/>
     </w:lvl>
-    <w:lvl w:ilvl="8" w:tplc="202ED9D0">
+    <w:lvl w:ilvl="8" w:tplc="E79CF2FE">
       <w:numFmt w:val="decimal"/>
       <w:lvlText w:val=""/>
       <w:lvlJc w:val="left"/>
     </w:lvl>
   </w:abstractNum>
   <w:abstractNum w:abstractNumId="1" w15:restartNumberingAfterBreak="0">
-    <w:nsid w:val="236A618D"/>
+    <w:nsid w:val="53483417"/>
     <w:multiLevelType w:val="hybridMultilevel"/>
-    <w:tmpl w:val="B89E0768"/>
-    <w:lvl w:ilvl="0" w:tplc="7F44EE36" w:tentative="1">
+    <w:tmpl w:val="07048BEE"/>
+    <w:lvl w:ilvl="0" w:tplc="CC36C046" w:tentative="1">
       <w:start w:val="1"/>
       <w:numFmt w:val="bullet"/>
       <w:lvlText w:val="●"/>
@@ -11187,7 +11450,7 @@
         <w:ind w:left="720" w:hanging="360"/>
       </w:pPr>
     </w:lvl>
-    <w:lvl w:ilvl="1" w:tplc="1E94595E" w:tentative="1">
+    <w:lvl w:ilvl="1" w:tplc="C9BE1D54" w:tentative="1">
       <w:start w:val="1"/>
       <w:numFmt w:val="bullet"/>
       <w:lvlText w:val="○"/>
@@ -11196,7 +11459,7 @@
         <w:ind w:left="1440" w:hanging="360"/>
       </w:pPr>
     </w:lvl>
-    <w:lvl w:ilvl="2" w:tplc="FC726C14" w:tentative="1">
+    <w:lvl w:ilvl="2" w:tplc="7CF67D6E" w:tentative="1">
       <w:start w:val="1"/>
       <w:numFmt w:val="bullet"/>
       <w:lvlText w:val="■"/>
@@ -11205,7 +11468,7 @@
         <w:ind w:left="2160" w:hanging="360"/>
       </w:pPr>
     </w:lvl>
-    <w:lvl w:ilvl="3" w:tplc="C5F03F74" w:tentative="1">
+    <w:lvl w:ilvl="3" w:tplc="557E58FA" w:tentative="1">
       <w:start w:val="1"/>
       <w:numFmt w:val="bullet"/>
       <w:lvlText w:val="●"/>
@@ -11214,7 +11477,7 @@
         <w:ind w:left="2880" w:hanging="360"/>
       </w:pPr>
     </w:lvl>
-    <w:lvl w:ilvl="4" w:tplc="B9381954" w:tentative="1">
+    <w:lvl w:ilvl="4" w:tplc="E6AA8418" w:tentative="1">
       <w:start w:val="1"/>
       <w:numFmt w:val="bullet"/>
       <w:lvlText w:val="○"/>
@@ -11223,7 +11486,7 @@
         <w:ind w:left="3600" w:hanging="360"/>
       </w:pPr>
     </w:lvl>
-    <w:lvl w:ilvl="5" w:tplc="FEC208E8" w:tentative="1">
+    <w:lvl w:ilvl="5" w:tplc="F53CBD88" w:tentative="1">
       <w:start w:val="1"/>
       <w:numFmt w:val="bullet"/>
       <w:lvlText w:val="■"/>
@@ -11232,7 +11495,7 @@
         <w:ind w:left="4320" w:hanging="360"/>
       </w:pPr>
     </w:lvl>
-    <w:lvl w:ilvl="6" w:tplc="00F4E6A8" w:tentative="1">
+    <w:lvl w:ilvl="6" w:tplc="9BE882F0" w:tentative="1">
       <w:start w:val="1"/>
       <w:numFmt w:val="bullet"/>
       <w:lvlText w:val="●"/>
@@ -11241,7 +11504,7 @@
         <w:ind w:left="5040" w:hanging="360"/>
       </w:pPr>
     </w:lvl>
-    <w:lvl w:ilvl="7" w:tplc="439E6F8A" w:tentative="1">
+    <w:lvl w:ilvl="7" w:tplc="AC3E5EC2" w:tentative="1">
       <w:start w:val="1"/>
       <w:numFmt w:val="bullet"/>
       <w:lvlText w:val="●"/>
@@ -11250,7 +11513,7 @@
         <w:ind w:left="5760" w:hanging="360"/>
       </w:pPr>
     </w:lvl>
-    <w:lvl w:ilvl="8" w:tplc="8FF4F9C8" w:tentative="1">
+    <w:lvl w:ilvl="8" w:tplc="9684BE32" w:tentative="1">
       <w:start w:val="1"/>
       <w:numFmt w:val="bullet"/>
       <w:lvlText w:val="●"/>
@@ -11261,10 +11524,10 @@
     </w:lvl>
   </w:abstractNum>
   <w:abstractNum w:abstractNumId="2" w15:restartNumberingAfterBreak="0">
-    <w:nsid w:val="646F453C"/>
+    <w:nsid w:val="6CC926BD"/>
     <w:multiLevelType w:val="hybridMultilevel"/>
-    <w:tmpl w:val="879E4544"/>
-    <w:lvl w:ilvl="0" w:tplc="90709430">
+    <w:tmpl w:val="B62E877E"/>
+    <w:lvl w:ilvl="0" w:tplc="9000C242">
       <w:start w:val="1"/>
       <w:numFmt w:val="decimal"/>
       <w:lvlText w:val="%1."/>
@@ -11273,60 +11536,60 @@
         <w:ind w:left="540" w:hanging="300"/>
       </w:pPr>
     </w:lvl>
-    <w:lvl w:ilvl="1" w:tplc="94224B7E">
+    <w:lvl w:ilvl="1" w:tplc="D1FC2E18">
       <w:numFmt w:val="decimal"/>
       <w:lvlText w:val=""/>
       <w:lvlJc w:val="left"/>
     </w:lvl>
-    <w:lvl w:ilvl="2" w:tplc="96802AB2">
+    <w:lvl w:ilvl="2" w:tplc="959A9B9E">
       <w:numFmt w:val="decimal"/>
       <w:lvlText w:val=""/>
       <w:lvlJc w:val="left"/>
     </w:lvl>
-    <w:lvl w:ilvl="3" w:tplc="4066E600">
+    <w:lvl w:ilvl="3" w:tplc="72581FC2">
       <w:numFmt w:val="decimal"/>
       <w:lvlText w:val=""/>
       <w:lvlJc w:val="left"/>
     </w:lvl>
-    <w:lvl w:ilvl="4" w:tplc="3898A936">
+    <w:lvl w:ilvl="4" w:tplc="B0E6D6E2">
       <w:numFmt w:val="decimal"/>
       <w:lvlText w:val=""/>
       <w:lvlJc w:val="left"/>
     </w:lvl>
-    <w:lvl w:ilvl="5" w:tplc="EEE67202">
+    <w:lvl w:ilvl="5" w:tplc="44F4C6BE">
       <w:numFmt w:val="decimal"/>
       <w:lvlText w:val=""/>
       <w:lvlJc w:val="left"/>
     </w:lvl>
-    <w:lvl w:ilvl="6" w:tplc="1D6ADC26">
+    <w:lvl w:ilvl="6" w:tplc="0EFE61A8">
       <w:numFmt w:val="decimal"/>
       <w:lvlText w:val=""/>
       <w:lvlJc w:val="left"/>
     </w:lvl>
-    <w:lvl w:ilvl="7" w:tplc="26D874EC">
+    <w:lvl w:ilvl="7" w:tplc="FF0AEEB4">
       <w:numFmt w:val="decimal"/>
       <w:lvlText w:val=""/>
       <w:lvlJc w:val="left"/>
     </w:lvl>
-    <w:lvl w:ilvl="8" w:tplc="E0CC8E1C">
+    <w:lvl w:ilvl="8" w:tplc="29AE4F90">
       <w:numFmt w:val="decimal"/>
       <w:lvlText w:val=""/>
       <w:lvlJc w:val="left"/>
     </w:lvl>
   </w:abstractNum>
-  <w:num w:numId="1" w16cid:durableId="2056001803">
+  <w:num w:numId="1" w16cid:durableId="1880431428">
     <w:abstractNumId w:val="1"/>
     <w:lvlOverride w:ilvl="0">
       <w:startOverride w:val="1"/>
     </w:lvlOverride>
   </w:num>
-  <w:num w:numId="2" w16cid:durableId="1295066457">
+  <w:num w:numId="2" w16cid:durableId="415788650">
     <w:abstractNumId w:val="0"/>
     <w:lvlOverride w:ilvl="0">
       <w:startOverride w:val="1"/>
     </w:lvlOverride>
   </w:num>
-  <w:num w:numId="3" w16cid:durableId="755588304">
+  <w:num w:numId="3" w16cid:durableId="2137261162">
     <w:abstractNumId w:val="2"/>
     <w:lvlOverride w:ilvl="0">
       <w:startOverride w:val="1"/>
@@ -11968,7 +12231,7 @@
     <w:autoRedefine/>
     <w:uiPriority w:val="39"/>
     <w:unhideWhenUsed/>
-    <w:rsid w:val="002B700D"/>
+    <w:rsid w:val="002301A0"/>
     <w:pPr>
       <w:spacing w:after="100"/>
     </w:pPr>
@@ -11980,7 +12243,7 @@
     <w:autoRedefine/>
     <w:uiPriority w:val="39"/>
     <w:unhideWhenUsed/>
-    <w:rsid w:val="002B700D"/>
+    <w:rsid w:val="002301A0"/>
     <w:pPr>
       <w:spacing w:after="100"/>
       <w:ind w:left="210"/>

</xml_diff>